<commit_message>
Patrones Bridge y Decorator
</commit_message>
<xml_diff>
--- a/Parcial Practico - Johan Calderon.docx
+++ b/Parcial Practico - Johan Calderon.docx
@@ -925,7 +925,7 @@
                                         <w:szCs w:val="40"/>
                                         <w:lang w:val="es-ES"/>
                                       </w:rPr>
-                                      <w:t>06</w:t>
+                                      <w:t>13</w:t>
                                     </w:r>
                                     <w:r>
                                       <w:rPr>
@@ -1024,7 +1024,7 @@
                                   <w:szCs w:val="40"/>
                                   <w:lang w:val="es-ES"/>
                                 </w:rPr>
-                                <w:t>06</w:t>
+                                <w:t>13</w:t>
                               </w:r>
                               <w:r>
                                 <w:rPr>
@@ -1233,6 +1233,9 @@
     <w:sdt>
       <w:sdtPr>
         <w:rPr>
+          <w:b w:val="0"/>
+          <w:bCs w:val="0"/>
+          <w:kern w:val="0"/>
           <w:szCs w:val="24"/>
           <w:lang w:val="es-ES"/>
         </w:rPr>
@@ -1242,11 +1245,6 @@
           <w:docPartUnique/>
         </w:docPartObj>
       </w:sdtPr>
-      <w:sdtEndPr>
-        <w:rPr>
-          <w:kern w:val="0"/>
-        </w:rPr>
-      </w:sdtEndPr>
       <w:sdtContent>
         <w:p>
           <w:pPr>
@@ -30941,12 +30939,21 @@
       <w:r>
         <w:t xml:space="preserve">En lugar de usar muchos </w:t>
       </w:r>
+      <w:proofErr w:type="gramStart"/>
       <w:r>
         <w:rPr>
           <w:b/>
           <w:bCs/>
         </w:rPr>
-        <w:t>set()</w:t>
+        <w:t>set(</w:t>
+      </w:r>
+      <w:proofErr w:type="gramEnd"/>
+      <w:r>
+        <w:rPr>
+          <w:b/>
+          <w:bCs/>
+        </w:rPr>
+        <w:t>)</w:t>
       </w:r>
       <w:r>
         <w:t xml:space="preserve"> que hacen el código difícil de leer, uso </w:t>
@@ -31686,10 +31693,7 @@
         <w:t xml:space="preserve"> </w:t>
       </w:r>
       <w:r>
-        <w:t>P</w:t>
-      </w:r>
-      <w:r>
-        <w:t>ermite crear un objeto nuevo a partir de otro ya existente. En lugar de construir todo desde cero, el sistema toma una copia de un objeto base y la reutiliza como punto de partida.</w:t>
+        <w:t>Permite crear un objeto nuevo a partir de otro ya existente. En lugar de construir todo desde cero, el sistema toma una copia de un objeto base y la reutiliza como punto de partida.</w:t>
       </w:r>
     </w:p>
     <w:p>
@@ -31770,7 +31774,15 @@
           <w:b/>
           <w:bCs/>
         </w:rPr>
-        <w:t>Modelo Prototype</w:t>
+        <w:t>Interfaz</w:t>
+      </w:r>
+      <w:r>
+        <w:rPr>
+          <w:rFonts w:cs="Arial"/>
+          <w:b/>
+          <w:bCs/>
+        </w:rPr>
+        <w:t xml:space="preserve"> Prototype</w:t>
       </w:r>
     </w:p>
     <w:p>
@@ -31785,6 +31797,7 @@
       <w:r>
         <w:rPr>
           <w:rFonts w:cs="Arial"/>
+          <w:noProof/>
         </w:rPr>
         <w:drawing>
           <wp:inline distT="0" distB="0" distL="0" distR="0" wp14:anchorId="4C8861DE" wp14:editId="79D492C4">
@@ -31861,7 +31874,15 @@
           <w:bCs/>
         </w:rPr>
         <w:lastRenderedPageBreak/>
-        <w:t xml:space="preserve">Modelo </w:t>
+        <w:t>Clase</w:t>
+      </w:r>
+      <w:r>
+        <w:rPr>
+          <w:rFonts w:cs="Arial"/>
+          <w:b/>
+          <w:bCs/>
+        </w:rPr>
+        <w:t xml:space="preserve"> </w:t>
       </w:r>
       <w:proofErr w:type="spellStart"/>
       <w:r>
@@ -31886,6 +31907,7 @@
       <w:r>
         <w:rPr>
           <w:rFonts w:cs="Arial"/>
+          <w:noProof/>
         </w:rPr>
         <w:drawing>
           <wp:inline distT="0" distB="0" distL="0" distR="0" wp14:anchorId="74CC7397" wp14:editId="0940AD16">
@@ -31970,6 +31992,7 @@
         <w:rPr>
           <w:b/>
           <w:bCs/>
+          <w:noProof/>
         </w:rPr>
         <w:drawing>
           <wp:inline distT="0" distB="0" distL="0" distR="0" wp14:anchorId="2BEA9E2B" wp14:editId="0764E140">
@@ -32057,6 +32080,9 @@
     <w:p/>
     <w:p>
       <w:r>
+        <w:rPr>
+          <w:noProof/>
+        </w:rPr>
         <w:drawing>
           <wp:inline distT="0" distB="0" distL="0" distR="0" wp14:anchorId="1B7C91A3" wp14:editId="1BC2F895">
             <wp:extent cx="3604260" cy="4622733"/>
@@ -32097,16 +32123,7 @@
     <w:p/>
     <w:p>
       <w:r>
-        <w:t>Se c</w:t>
-      </w:r>
-      <w:r>
-        <w:t>opia el</w:t>
-      </w:r>
-      <w:r>
-        <w:t xml:space="preserve"> id </w:t>
-      </w:r>
-      <w:r>
-        <w:t xml:space="preserve">de esa prescripción y llama al </w:t>
+        <w:t xml:space="preserve">Se copia el id de esa prescripción y llama al </w:t>
       </w:r>
       <w:proofErr w:type="spellStart"/>
       <w:r>
@@ -32120,6 +32137,9 @@
     <w:p/>
     <w:p>
       <w:r>
+        <w:rPr>
+          <w:noProof/>
+        </w:rPr>
         <w:lastRenderedPageBreak/>
         <w:drawing>
           <wp:inline distT="0" distB="0" distL="0" distR="0" wp14:anchorId="475DD3AA" wp14:editId="0DF26DAE">
@@ -32164,10 +32184,7 @@
         <w:spacing w:line="480" w:lineRule="auto"/>
       </w:pPr>
       <w:r>
-        <w:t>El sistema crea una nueva prescripción basada en la original, pero con un nuevo</w:t>
-      </w:r>
-      <w:r>
-        <w:t xml:space="preserve"> id.</w:t>
+        <w:t>El sistema crea una nueva prescripción basada en la original, pero con un nuevo id.</w:t>
       </w:r>
     </w:p>
     <w:p>
@@ -32308,10 +32325,7 @@
         <w:t xml:space="preserve">Explicación: </w:t>
       </w:r>
       <w:r>
-        <w:t>Este diagrama muestra que</w:t>
-      </w:r>
-      <w:r>
-        <w:t xml:space="preserve"> </w:t>
+        <w:t xml:space="preserve">Este diagrama muestra que </w:t>
       </w:r>
       <w:proofErr w:type="spellStart"/>
       <w:r>
@@ -32323,10 +32337,7 @@
       </w:r>
       <w:proofErr w:type="spellEnd"/>
       <w:r>
-        <w:t xml:space="preserve"> </w:t>
-      </w:r>
-      <w:r>
-        <w:t xml:space="preserve">implementa el patrón </w:t>
+        <w:t xml:space="preserve"> implementa el patrón </w:t>
       </w:r>
       <w:r>
         <w:rPr>
@@ -32336,10 +32347,7 @@
         <w:t>Prototype</w:t>
       </w:r>
       <w:r>
-        <w:t xml:space="preserve"> porque tiene el método</w:t>
-      </w:r>
-      <w:r>
-        <w:t xml:space="preserve"> </w:t>
+        <w:t xml:space="preserve"> porque tiene el método </w:t>
       </w:r>
       <w:proofErr w:type="spellStart"/>
       <w:proofErr w:type="gramStart"/>
@@ -32352,13 +32360,7 @@
       </w:r>
       <w:proofErr w:type="gramEnd"/>
       <w:r>
-        <w:t>),</w:t>
-      </w:r>
-      <w:r>
-        <w:t xml:space="preserve"> que permite crear una copia de una prescripción existente. Luego,</w:t>
-      </w:r>
-      <w:r>
-        <w:t xml:space="preserve"> </w:t>
+        <w:t xml:space="preserve">), que permite crear una copia de una prescripción existente. Luego, </w:t>
       </w:r>
       <w:proofErr w:type="spellStart"/>
       <w:r>
@@ -32370,10 +32372,7 @@
       </w:r>
       <w:proofErr w:type="spellEnd"/>
       <w:r>
-        <w:t xml:space="preserve"> </w:t>
-      </w:r>
-      <w:r>
-        <w:t>usa esa copia para generar una nueva receta, y</w:t>
+        <w:t xml:space="preserve"> usa esa copia para generar una nueva receta, y</w:t>
       </w:r>
       <w:r>
         <w:t xml:space="preserve"> </w:t>
@@ -32470,10 +32469,7 @@
         <w:t xml:space="preserve"> </w:t>
       </w:r>
       <w:r>
-        <w:t>S</w:t>
-      </w:r>
-      <w:r>
-        <w:t>irve para convertir un objeto de un formato a otro que el sistema sí pueda entender.</w:t>
+        <w:t>Sirve para convertir un objeto de un formato a otro que el sistema sí pueda entender.</w:t>
       </w:r>
     </w:p>
     <w:p>
@@ -32683,13 +32679,7 @@
       </w:pPr>
       <w:bookmarkStart w:id="38" w:name="_Toc226395170"/>
       <w:r>
-        <w:t>Aplicación</w:t>
-      </w:r>
-      <w:r>
-        <w:t xml:space="preserve"> del </w:t>
-      </w:r>
-      <w:r>
-        <w:t xml:space="preserve">patrón </w:t>
+        <w:t xml:space="preserve">Aplicación del patrón </w:t>
       </w:r>
       <w:proofErr w:type="spellStart"/>
       <w:r>
@@ -32745,6 +32735,7 @@
       <w:r>
         <w:rPr>
           <w:rFonts w:cs="Arial"/>
+          <w:noProof/>
         </w:rPr>
         <w:drawing>
           <wp:inline distT="0" distB="0" distL="0" distR="0" wp14:anchorId="77CCA90A" wp14:editId="1D0CC43E">
@@ -32853,6 +32844,7 @@
       <w:r>
         <w:rPr>
           <w:rFonts w:cs="Arial"/>
+          <w:noProof/>
         </w:rPr>
         <w:drawing>
           <wp:inline distT="0" distB="0" distL="0" distR="0" wp14:anchorId="73C8260C" wp14:editId="23A9DC84">
@@ -32964,6 +32956,7 @@
           <w:rFonts w:cs="Arial"/>
           <w:b/>
           <w:bCs/>
+          <w:noProof/>
         </w:rPr>
         <w:drawing>
           <wp:inline distT="0" distB="0" distL="0" distR="0" wp14:anchorId="47FF8FC4" wp14:editId="25A7B60E">
@@ -33088,10 +33081,7 @@
       </w:r>
       <w:r>
         <w:br/>
-        <w:t xml:space="preserve">Cada dispositivo puede enviar datos con nombres distintos, por </w:t>
-      </w:r>
-      <w:r>
-        <w:t xml:space="preserve">ejemplo, </w:t>
+        <w:t xml:space="preserve">Cada dispositivo puede enviar datos con nombres distintos, por ejemplo, </w:t>
       </w:r>
       <w:proofErr w:type="spellStart"/>
       <w:r>
@@ -33099,10 +33089,7 @@
       </w:r>
       <w:proofErr w:type="spellEnd"/>
       <w:r>
-        <w:t>,</w:t>
-      </w:r>
-      <w:r>
-        <w:t xml:space="preserve"> </w:t>
+        <w:t xml:space="preserve">, </w:t>
       </w:r>
       <w:proofErr w:type="spellStart"/>
       <w:r>
@@ -33118,10 +33105,7 @@
       </w:r>
       <w:proofErr w:type="spellEnd"/>
       <w:r>
-        <w:t>, pero el sistema trabaja con una sola clase llamad</w:t>
-      </w:r>
-      <w:r>
-        <w:t xml:space="preserve">a </w:t>
+        <w:t xml:space="preserve">, pero el sistema trabaja con una sola clase llamada </w:t>
       </w:r>
       <w:proofErr w:type="spellStart"/>
       <w:r>
@@ -33131,10 +33115,10 @@
         </w:rPr>
         <w:t>Observation</w:t>
       </w:r>
+      <w:proofErr w:type="spellEnd"/>
       <w:r>
         <w:t>.</w:t>
       </w:r>
-      <w:proofErr w:type="spellEnd"/>
     </w:p>
     <w:p>
       <w:pPr>
@@ -33258,6 +33242,9 @@
         <w:spacing w:line="480" w:lineRule="auto"/>
       </w:pPr>
       <w:r>
+        <w:rPr>
+          <w:noProof/>
+        </w:rPr>
         <w:drawing>
           <wp:inline distT="0" distB="0" distL="0" distR="0" wp14:anchorId="72F0707B" wp14:editId="028BA5BA">
             <wp:extent cx="2796540" cy="3827347"/>
@@ -33469,6 +33456,7 @@
     <w:p>
       <w:pPr>
         <w:spacing w:line="480" w:lineRule="auto"/>
+        <w:jc w:val="both"/>
       </w:pPr>
       <w:r>
         <w:t xml:space="preserve">El adaptador recibe el formato original del sensor y lo convierte en una </w:t>
@@ -33510,8 +33498,2052 @@
         <w:t>, y el sistema la procesa normalmente.</w:t>
       </w:r>
     </w:p>
+    <w:p>
+      <w:pPr>
+        <w:spacing w:line="480" w:lineRule="auto"/>
+        <w:jc w:val="both"/>
+      </w:pPr>
+    </w:p>
+    <w:p>
+      <w:pPr>
+        <w:spacing w:line="480" w:lineRule="auto"/>
+        <w:jc w:val="both"/>
+      </w:pPr>
+    </w:p>
+    <w:p>
+      <w:pPr>
+        <w:spacing w:line="480" w:lineRule="auto"/>
+        <w:jc w:val="both"/>
+      </w:pPr>
+    </w:p>
+    <w:p>
+      <w:pPr>
+        <w:spacing w:line="480" w:lineRule="auto"/>
+        <w:jc w:val="both"/>
+      </w:pPr>
+    </w:p>
+    <w:p>
+      <w:pPr>
+        <w:pStyle w:val="Ttulo1"/>
+        <w:numPr>
+          <w:ilvl w:val="0"/>
+          <w:numId w:val="10"/>
+        </w:numPr>
+        <w:spacing w:line="480" w:lineRule="auto"/>
+      </w:pPr>
+      <w:r>
+        <w:lastRenderedPageBreak/>
+        <w:t xml:space="preserve">Patrón </w:t>
+      </w:r>
+      <w:r>
+        <w:t>Bridge</w:t>
+      </w:r>
+    </w:p>
+    <w:p>
+      <w:pPr>
+        <w:pStyle w:val="Ttulo1"/>
+        <w:numPr>
+          <w:ilvl w:val="1"/>
+          <w:numId w:val="10"/>
+        </w:numPr>
+      </w:pPr>
+      <w:r>
+        <w:t xml:space="preserve">Análisis para la aplicación del </w:t>
+      </w:r>
+      <w:r>
+        <w:t>Bridge</w:t>
+      </w:r>
+    </w:p>
+    <w:p>
+      <w:pPr>
+        <w:spacing w:line="480" w:lineRule="auto"/>
+        <w:jc w:val="both"/>
+        <w:rPr>
+          <w:rFonts w:cs="Arial"/>
+        </w:rPr>
+      </w:pPr>
+      <w:r>
+        <w:rPr>
+          <w:rFonts w:cs="Arial"/>
+          <w:b/>
+          <w:bCs/>
+        </w:rPr>
+        <w:t>Objetivo del patrón:</w:t>
+      </w:r>
+      <w:r>
+        <w:rPr>
+          <w:rFonts w:cs="Arial"/>
+          <w:b/>
+          <w:bCs/>
+        </w:rPr>
+        <w:t xml:space="preserve"> </w:t>
+      </w:r>
+      <w:r>
+        <w:t>Separar una cosa de otra para que ambas puedan cambiar por separado.</w:t>
+      </w:r>
+    </w:p>
+    <w:p>
+      <w:pPr>
+        <w:pStyle w:val="NormalWeb"/>
+        <w:spacing w:line="480" w:lineRule="auto"/>
+        <w:jc w:val="both"/>
+        <w:rPr>
+          <w:rFonts w:cs="Arial"/>
+        </w:rPr>
+      </w:pPr>
+      <w:r>
+        <w:rPr>
+          <w:rFonts w:cs="Arial"/>
+          <w:b/>
+          <w:bCs/>
+        </w:rPr>
+        <w:t>Motivación en el proyecto:</w:t>
+      </w:r>
+      <w:r>
+        <w:rPr>
+          <w:rFonts w:cs="Arial"/>
+        </w:rPr>
+        <w:t xml:space="preserve"> </w:t>
+      </w:r>
+      <w:r>
+        <w:t xml:space="preserve">En </w:t>
+      </w:r>
+      <w:r>
+        <w:rPr>
+          <w:rFonts w:cs="Arial"/>
+        </w:rPr>
+        <w:t>el</w:t>
+      </w:r>
+      <w:r>
+        <w:rPr>
+          <w:rFonts w:cs="Arial"/>
+        </w:rPr>
+        <w:t xml:space="preserve"> sistema, una alerta puede ser clínica o de </w:t>
+      </w:r>
+      <w:proofErr w:type="spellStart"/>
+      <w:r>
+        <w:rPr>
+          <w:rFonts w:cs="Arial"/>
+        </w:rPr>
+        <w:t>IoT</w:t>
+      </w:r>
+      <w:proofErr w:type="spellEnd"/>
+      <w:r>
+        <w:rPr>
+          <w:rFonts w:cs="Arial"/>
+        </w:rPr>
+        <w:t xml:space="preserve">, y además esa alerta puede enviarse por distintos canales, por </w:t>
+      </w:r>
+      <w:r>
+        <w:rPr>
+          <w:rFonts w:cs="Arial"/>
+        </w:rPr>
+        <w:t>ejemplo,</w:t>
+      </w:r>
+      <w:r>
+        <w:rPr>
+          <w:rFonts w:cs="Arial"/>
+        </w:rPr>
+        <w:t xml:space="preserve"> consola o correo.</w:t>
+      </w:r>
+      <w:r>
+        <w:rPr>
+          <w:rFonts w:cs="Arial"/>
+        </w:rPr>
+        <w:t xml:space="preserve"> </w:t>
+      </w:r>
+      <w:r>
+        <w:rPr>
+          <w:rFonts w:cs="Arial"/>
+        </w:rPr>
+        <w:t>Con Bridge, separ</w:t>
+      </w:r>
+      <w:r>
+        <w:rPr>
+          <w:rFonts w:cs="Arial"/>
+        </w:rPr>
+        <w:t>o</w:t>
+      </w:r>
+      <w:r>
+        <w:rPr>
+          <w:rFonts w:cs="Arial"/>
+        </w:rPr>
+        <w:t>:</w:t>
+      </w:r>
+    </w:p>
+    <w:p>
+      <w:pPr>
+        <w:numPr>
+          <w:ilvl w:val="0"/>
+          <w:numId w:val="13"/>
+        </w:numPr>
+        <w:spacing w:before="100" w:beforeAutospacing="1" w:after="100" w:afterAutospacing="1" w:line="480" w:lineRule="auto"/>
+        <w:jc w:val="both"/>
+        <w:rPr>
+          <w:rFonts w:cs="Arial"/>
+        </w:rPr>
+      </w:pPr>
+      <w:r>
+        <w:rPr>
+          <w:rFonts w:cs="Arial"/>
+        </w:rPr>
+        <w:t>E</w:t>
+      </w:r>
+      <w:r>
+        <w:rPr>
+          <w:rFonts w:cs="Arial"/>
+        </w:rPr>
+        <w:t xml:space="preserve">l contenido de la alerta </w:t>
+      </w:r>
+    </w:p>
+    <w:p>
+      <w:pPr>
+        <w:numPr>
+          <w:ilvl w:val="0"/>
+          <w:numId w:val="13"/>
+        </w:numPr>
+        <w:spacing w:before="100" w:beforeAutospacing="1" w:after="100" w:afterAutospacing="1" w:line="480" w:lineRule="auto"/>
+        <w:jc w:val="both"/>
+        <w:rPr>
+          <w:rFonts w:cs="Arial"/>
+        </w:rPr>
+      </w:pPr>
+      <w:r>
+        <w:rPr>
+          <w:rFonts w:cs="Arial"/>
+        </w:rPr>
+        <w:t>L</w:t>
+      </w:r>
+      <w:r>
+        <w:rPr>
+          <w:rFonts w:cs="Arial"/>
+        </w:rPr>
+        <w:t xml:space="preserve">a forma de enviarla </w:t>
+      </w:r>
+    </w:p>
+    <w:p>
+      <w:pPr>
+        <w:spacing w:before="100" w:beforeAutospacing="1" w:after="100" w:afterAutospacing="1" w:line="480" w:lineRule="auto"/>
+        <w:ind w:firstLine="0"/>
+        <w:jc w:val="both"/>
+        <w:rPr>
+          <w:rFonts w:cs="Arial"/>
+        </w:rPr>
+      </w:pPr>
+      <w:r>
+        <w:rPr>
+          <w:rFonts w:cs="Arial"/>
+        </w:rPr>
+        <w:t>Así, si mañana quier</w:t>
+      </w:r>
+      <w:r>
+        <w:rPr>
+          <w:rFonts w:cs="Arial"/>
+        </w:rPr>
+        <w:t>o</w:t>
+      </w:r>
+      <w:r>
+        <w:rPr>
+          <w:rFonts w:cs="Arial"/>
+        </w:rPr>
+        <w:t xml:space="preserve"> mandar alertas por correo en vez de consola, no </w:t>
+      </w:r>
+      <w:r>
+        <w:rPr>
+          <w:rFonts w:cs="Arial"/>
+        </w:rPr>
+        <w:t xml:space="preserve">se debe </w:t>
+      </w:r>
+      <w:r>
+        <w:rPr>
+          <w:rFonts w:cs="Arial"/>
+        </w:rPr>
+        <w:t>cambi</w:t>
+      </w:r>
+      <w:r>
+        <w:rPr>
+          <w:rFonts w:cs="Arial"/>
+        </w:rPr>
+        <w:t>ar</w:t>
+      </w:r>
+      <w:r>
+        <w:rPr>
+          <w:rFonts w:cs="Arial"/>
+        </w:rPr>
+        <w:t xml:space="preserve"> toda la lógica del sistema.</w:t>
+      </w:r>
+    </w:p>
+    <w:p>
+      <w:pPr>
+        <w:pStyle w:val="Ttulo1"/>
+        <w:numPr>
+          <w:ilvl w:val="1"/>
+          <w:numId w:val="10"/>
+        </w:numPr>
+      </w:pPr>
+      <w:r>
+        <w:t xml:space="preserve">Aplicación del patrón </w:t>
+      </w:r>
+      <w:r>
+        <w:t>Bridge</w:t>
+      </w:r>
+    </w:p>
+    <w:p>
+      <w:pPr>
+        <w:pStyle w:val="NormalWeb"/>
+        <w:spacing w:line="480" w:lineRule="auto"/>
+        <w:ind w:firstLine="360"/>
+        <w:rPr>
+          <w:rFonts w:cs="Arial"/>
+          <w:b/>
+          <w:bCs/>
+        </w:rPr>
+      </w:pPr>
+      <w:r>
+        <w:rPr>
+          <w:rFonts w:cs="Arial"/>
+          <w:b/>
+          <w:bCs/>
+        </w:rPr>
+        <w:t xml:space="preserve">Interfaz </w:t>
+      </w:r>
+      <w:proofErr w:type="spellStart"/>
+      <w:r>
+        <w:rPr>
+          <w:rFonts w:cs="Arial"/>
+          <w:b/>
+          <w:bCs/>
+        </w:rPr>
+        <w:t>AlertChannel</w:t>
+      </w:r>
+      <w:proofErr w:type="spellEnd"/>
+    </w:p>
+    <w:p>
+      <w:pPr>
+        <w:pStyle w:val="NormalWeb"/>
+        <w:spacing w:line="480" w:lineRule="auto"/>
+        <w:ind w:firstLine="360"/>
+        <w:rPr>
+          <w:rFonts w:cs="Arial"/>
+        </w:rPr>
+      </w:pPr>
+      <w:r>
+        <w:rPr>
+          <w:rFonts w:cs="Arial"/>
+        </w:rPr>
+        <w:drawing>
+          <wp:inline distT="0" distB="0" distL="0" distR="0" wp14:anchorId="02C6AD05" wp14:editId="5F1C6FE4">
+            <wp:extent cx="3909399" cy="1188823"/>
+            <wp:effectExtent l="0" t="0" r="0" b="0"/>
+            <wp:docPr id="2020031037" name="Imagen 1"/>
+            <wp:cNvGraphicFramePr>
+              <a:graphicFrameLocks xmlns:a="http://schemas.openxmlformats.org/drawingml/2006/main" noChangeAspect="1"/>
+            </wp:cNvGraphicFramePr>
+            <a:graphic xmlns:a="http://schemas.openxmlformats.org/drawingml/2006/main">
+              <a:graphicData uri="http://schemas.openxmlformats.org/drawingml/2006/picture">
+                <pic:pic xmlns:pic="http://schemas.openxmlformats.org/drawingml/2006/picture">
+                  <pic:nvPicPr>
+                    <pic:cNvPr id="2020031037" name=""/>
+                    <pic:cNvPicPr/>
+                  </pic:nvPicPr>
+                  <pic:blipFill>
+                    <a:blip r:embed="rId34"/>
+                    <a:stretch>
+                      <a:fillRect/>
+                    </a:stretch>
+                  </pic:blipFill>
+                  <pic:spPr>
+                    <a:xfrm>
+                      <a:off x="0" y="0"/>
+                      <a:ext cx="3909399" cy="1188823"/>
+                    </a:xfrm>
+                    <a:prstGeom prst="rect">
+                      <a:avLst/>
+                    </a:prstGeom>
+                  </pic:spPr>
+                </pic:pic>
+              </a:graphicData>
+            </a:graphic>
+          </wp:inline>
+        </w:drawing>
+      </w:r>
+    </w:p>
+    <w:p>
+      <w:pPr>
+        <w:pStyle w:val="NormalWeb"/>
+        <w:spacing w:line="480" w:lineRule="auto"/>
+        <w:ind w:firstLine="360"/>
+        <w:rPr>
+          <w:rFonts w:cs="Arial"/>
+          <w:b/>
+          <w:bCs/>
+        </w:rPr>
+      </w:pPr>
+    </w:p>
+    <w:p>
+      <w:pPr>
+        <w:pStyle w:val="NormalWeb"/>
+        <w:spacing w:line="480" w:lineRule="auto"/>
+        <w:ind w:firstLine="360"/>
+        <w:rPr>
+          <w:rFonts w:cs="Arial"/>
+          <w:b/>
+          <w:bCs/>
+        </w:rPr>
+      </w:pPr>
+    </w:p>
+    <w:p>
+      <w:pPr>
+        <w:pStyle w:val="NormalWeb"/>
+        <w:spacing w:line="480" w:lineRule="auto"/>
+        <w:ind w:firstLine="360"/>
+        <w:rPr>
+          <w:rFonts w:cs="Arial"/>
+          <w:b/>
+          <w:bCs/>
+        </w:rPr>
+      </w:pPr>
+    </w:p>
+    <w:p>
+      <w:pPr>
+        <w:shd w:val="clear" w:color="auto" w:fill="FFFFFF"/>
+        <w:spacing w:line="480" w:lineRule="auto"/>
+        <w:ind w:left="360" w:firstLine="360"/>
+        <w:rPr>
+          <w:rFonts w:ascii="Courier New" w:hAnsi="Courier New" w:cs="Courier New"/>
+          <w:color w:val="000000"/>
+          <w:sz w:val="18"/>
+          <w:szCs w:val="18"/>
+        </w:rPr>
+      </w:pPr>
+      <w:r>
+        <w:rPr>
+          <w:rFonts w:cs="Arial"/>
+          <w:b/>
+          <w:bCs/>
+        </w:rPr>
+        <w:lastRenderedPageBreak/>
+        <w:t xml:space="preserve">Clase </w:t>
+      </w:r>
+      <w:proofErr w:type="spellStart"/>
+      <w:r>
+        <w:rPr>
+          <w:rFonts w:cs="Arial"/>
+          <w:b/>
+          <w:bCs/>
+        </w:rPr>
+        <w:t>ConsoleAlertNotifier</w:t>
+      </w:r>
+      <w:proofErr w:type="spellEnd"/>
+      <w:r>
+        <w:rPr>
+          <w:rFonts w:cs="Arial"/>
+          <w:b/>
+          <w:bCs/>
+        </w:rPr>
+        <w:t xml:space="preserve"> </w:t>
+      </w:r>
+      <w:r>
+        <w:rPr>
+          <w:rFonts w:cs="Arial"/>
+        </w:rPr>
+        <w:t xml:space="preserve">Utiliza el Bridge para mandar el mensaje en consola cuando detecta una prescripción con </w:t>
+      </w:r>
+      <w:proofErr w:type="spellStart"/>
+      <w:r>
+        <w:rPr>
+          <w:rFonts w:cs="Arial"/>
+          <w:color w:val="A31515"/>
+        </w:rPr>
+        <w:t>medicationName</w:t>
+      </w:r>
+      <w:proofErr w:type="spellEnd"/>
+      <w:r>
+        <w:rPr>
+          <w:rFonts w:cs="Arial"/>
+          <w:color w:val="A31515"/>
+        </w:rPr>
+        <w:t>:</w:t>
+      </w:r>
+      <w:r>
+        <w:rPr>
+          <w:rFonts w:cs="Arial"/>
+          <w:color w:val="A31515"/>
+        </w:rPr>
+        <w:t xml:space="preserve"> “</w:t>
+      </w:r>
+      <w:proofErr w:type="spellStart"/>
+      <w:r>
+        <w:rPr>
+          <w:rFonts w:cs="Arial"/>
+          <w:color w:val="A31515"/>
+        </w:rPr>
+        <w:t>aspirin</w:t>
+      </w:r>
+      <w:proofErr w:type="spellEnd"/>
+      <w:r>
+        <w:rPr>
+          <w:rFonts w:cs="Arial"/>
+          <w:color w:val="A31515"/>
+        </w:rPr>
+        <w:t>”</w:t>
+      </w:r>
+    </w:p>
+    <w:p>
+      <w:pPr>
+        <w:pStyle w:val="NormalWeb"/>
+        <w:spacing w:line="480" w:lineRule="auto"/>
+        <w:ind w:firstLine="360"/>
+        <w:rPr>
+          <w:rFonts w:cs="Arial"/>
+        </w:rPr>
+      </w:pPr>
+      <w:r>
+        <w:rPr>
+          <w:rFonts w:cs="Arial"/>
+        </w:rPr>
+        <w:drawing>
+          <wp:inline distT="0" distB="0" distL="0" distR="0" wp14:anchorId="546C7835" wp14:editId="457C93B2">
+            <wp:extent cx="5612130" cy="2392680"/>
+            <wp:effectExtent l="0" t="0" r="7620" b="7620"/>
+            <wp:docPr id="1116251395" name="Imagen 2"/>
+            <wp:cNvGraphicFramePr>
+              <a:graphicFrameLocks xmlns:a="http://schemas.openxmlformats.org/drawingml/2006/main" noChangeAspect="1"/>
+            </wp:cNvGraphicFramePr>
+            <a:graphic xmlns:a="http://schemas.openxmlformats.org/drawingml/2006/main">
+              <a:graphicData uri="http://schemas.openxmlformats.org/drawingml/2006/picture">
+                <pic:pic xmlns:pic="http://schemas.openxmlformats.org/drawingml/2006/picture">
+                  <pic:nvPicPr>
+                    <pic:cNvPr id="1116251395" name=""/>
+                    <pic:cNvPicPr/>
+                  </pic:nvPicPr>
+                  <pic:blipFill>
+                    <a:blip r:embed="rId35"/>
+                    <a:stretch>
+                      <a:fillRect/>
+                    </a:stretch>
+                  </pic:blipFill>
+                  <pic:spPr>
+                    <a:xfrm>
+                      <a:off x="0" y="0"/>
+                      <a:ext cx="5612130" cy="2392680"/>
+                    </a:xfrm>
+                    <a:prstGeom prst="rect">
+                      <a:avLst/>
+                    </a:prstGeom>
+                  </pic:spPr>
+                </pic:pic>
+              </a:graphicData>
+            </a:graphic>
+          </wp:inline>
+        </w:drawing>
+      </w:r>
+    </w:p>
+    <w:p>
+      <w:pPr>
+        <w:pStyle w:val="NormalWeb"/>
+        <w:spacing w:line="480" w:lineRule="auto"/>
+        <w:ind w:firstLine="360"/>
+        <w:rPr>
+          <w:rFonts w:cs="Arial"/>
+          <w:b/>
+          <w:bCs/>
+        </w:rPr>
+      </w:pPr>
+      <w:r>
+        <w:rPr>
+          <w:rFonts w:cs="Arial"/>
+          <w:b/>
+          <w:bCs/>
+        </w:rPr>
+        <w:t xml:space="preserve">Clase </w:t>
+      </w:r>
+      <w:proofErr w:type="spellStart"/>
+      <w:r>
+        <w:rPr>
+          <w:rFonts w:cs="Arial"/>
+          <w:b/>
+          <w:bCs/>
+        </w:rPr>
+        <w:t>IoTAlertMessage</w:t>
+      </w:r>
+      <w:proofErr w:type="spellEnd"/>
+    </w:p>
+    <w:p>
+      <w:pPr>
+        <w:pStyle w:val="NormalWeb"/>
+        <w:spacing w:line="480" w:lineRule="auto"/>
+        <w:ind w:firstLine="360"/>
+        <w:rPr>
+          <w:rFonts w:cs="Arial"/>
+        </w:rPr>
+      </w:pPr>
+      <w:r>
+        <w:rPr>
+          <w:rFonts w:cs="Arial"/>
+        </w:rPr>
+        <w:drawing>
+          <wp:inline distT="0" distB="0" distL="0" distR="0" wp14:anchorId="6B0960FD" wp14:editId="56AD47B0">
+            <wp:extent cx="5612130" cy="1377950"/>
+            <wp:effectExtent l="0" t="0" r="7620" b="0"/>
+            <wp:docPr id="201482179" name="Imagen 3"/>
+            <wp:cNvGraphicFramePr>
+              <a:graphicFrameLocks xmlns:a="http://schemas.openxmlformats.org/drawingml/2006/main" noChangeAspect="1"/>
+            </wp:cNvGraphicFramePr>
+            <a:graphic xmlns:a="http://schemas.openxmlformats.org/drawingml/2006/main">
+              <a:graphicData uri="http://schemas.openxmlformats.org/drawingml/2006/picture">
+                <pic:pic xmlns:pic="http://schemas.openxmlformats.org/drawingml/2006/picture">
+                  <pic:nvPicPr>
+                    <pic:cNvPr id="201482179" name=""/>
+                    <pic:cNvPicPr/>
+                  </pic:nvPicPr>
+                  <pic:blipFill>
+                    <a:blip r:embed="rId36"/>
+                    <a:stretch>
+                      <a:fillRect/>
+                    </a:stretch>
+                  </pic:blipFill>
+                  <pic:spPr>
+                    <a:xfrm>
+                      <a:off x="0" y="0"/>
+                      <a:ext cx="5612130" cy="1377950"/>
+                    </a:xfrm>
+                    <a:prstGeom prst="rect">
+                      <a:avLst/>
+                    </a:prstGeom>
+                  </pic:spPr>
+                </pic:pic>
+              </a:graphicData>
+            </a:graphic>
+          </wp:inline>
+        </w:drawing>
+      </w:r>
+    </w:p>
+    <w:p>
+      <w:pPr>
+        <w:pStyle w:val="NormalWeb"/>
+        <w:spacing w:line="480" w:lineRule="auto"/>
+        <w:ind w:firstLine="360"/>
+        <w:jc w:val="both"/>
+        <w:rPr>
+          <w:rFonts w:cs="Arial"/>
+        </w:rPr>
+      </w:pPr>
+      <w:r>
+        <w:rPr>
+          <w:rFonts w:cs="Arial"/>
+          <w:b/>
+          <w:bCs/>
+        </w:rPr>
+        <w:t>Explicación:</w:t>
+      </w:r>
+      <w:r>
+        <w:rPr>
+          <w:rFonts w:cs="Arial"/>
+          <w:b/>
+          <w:bCs/>
+        </w:rPr>
+        <w:t xml:space="preserve"> </w:t>
+      </w:r>
+      <w:r>
+        <w:t>El patrón Bridge lo usé para separar el tipo de alerta del medio por donde se envía.</w:t>
+      </w:r>
+      <w:r>
+        <w:t xml:space="preserve"> </w:t>
+      </w:r>
+      <w:r>
+        <w:t xml:space="preserve">Así el sistema puede tener </w:t>
+      </w:r>
+      <w:r>
+        <w:rPr>
+          <w:b/>
+          <w:bCs/>
+        </w:rPr>
+        <w:t>alertas clínicas</w:t>
+      </w:r>
+      <w:r>
+        <w:t xml:space="preserve"> o de </w:t>
+      </w:r>
+      <w:proofErr w:type="spellStart"/>
+      <w:r>
+        <w:rPr>
+          <w:b/>
+          <w:bCs/>
+        </w:rPr>
+        <w:t>IoT</w:t>
+      </w:r>
+      <w:proofErr w:type="spellEnd"/>
+      <w:r>
+        <w:t>, y al mismo tiempo enviarlas por consola o correo sin cambiar la lógica principal.</w:t>
+      </w:r>
+      <w:r>
+        <w:br/>
+        <w:t>Eso hace que el sistema sea más flexible porque el mensaje y el canal pueden cambiar por separado.</w:t>
+      </w:r>
+    </w:p>
+    <w:p>
+      <w:pPr>
+        <w:spacing w:line="480" w:lineRule="auto"/>
+        <w:ind w:firstLine="0"/>
+        <w:jc w:val="both"/>
+      </w:pPr>
+    </w:p>
+    <w:p>
+      <w:pPr>
+        <w:pStyle w:val="Ttulo1"/>
+        <w:numPr>
+          <w:ilvl w:val="1"/>
+          <w:numId w:val="10"/>
+        </w:numPr>
+      </w:pPr>
+      <w:r>
+        <w:lastRenderedPageBreak/>
+        <w:t>Pruebas de funcionalidad</w:t>
+      </w:r>
+    </w:p>
+    <w:p>
+      <w:pPr>
+        <w:spacing w:line="480" w:lineRule="auto"/>
+      </w:pPr>
+      <w:r>
+        <w:t>Para hacer la prueba clínica, e</w:t>
+      </w:r>
+      <w:r>
+        <w:t>nvi</w:t>
+      </w:r>
+      <w:r>
+        <w:t>é</w:t>
+      </w:r>
+      <w:r>
+        <w:t xml:space="preserve"> una prescripción con </w:t>
+      </w:r>
+      <w:r>
+        <w:t>“</w:t>
+      </w:r>
+      <w:proofErr w:type="spellStart"/>
+      <w:r>
+        <w:t>aspirin</w:t>
+      </w:r>
+      <w:proofErr w:type="spellEnd"/>
+      <w:r>
+        <w:t>”</w:t>
+      </w:r>
+      <w:r>
+        <w:t>.</w:t>
+      </w:r>
+    </w:p>
+    <w:p>
+      <w:pPr>
+        <w:spacing w:line="480" w:lineRule="auto"/>
+      </w:pPr>
+      <w:r>
+        <w:drawing>
+          <wp:inline distT="0" distB="0" distL="0" distR="0" wp14:anchorId="4702D993" wp14:editId="395C1FF1">
+            <wp:extent cx="4000500" cy="2512088"/>
+            <wp:effectExtent l="0" t="0" r="0" b="2540"/>
+            <wp:docPr id="158797680" name="Imagen 4"/>
+            <wp:cNvGraphicFramePr>
+              <a:graphicFrameLocks xmlns:a="http://schemas.openxmlformats.org/drawingml/2006/main" noChangeAspect="1"/>
+            </wp:cNvGraphicFramePr>
+            <a:graphic xmlns:a="http://schemas.openxmlformats.org/drawingml/2006/main">
+              <a:graphicData uri="http://schemas.openxmlformats.org/drawingml/2006/picture">
+                <pic:pic xmlns:pic="http://schemas.openxmlformats.org/drawingml/2006/picture">
+                  <pic:nvPicPr>
+                    <pic:cNvPr id="158797680" name=""/>
+                    <pic:cNvPicPr/>
+                  </pic:nvPicPr>
+                  <pic:blipFill>
+                    <a:blip r:embed="rId37"/>
+                    <a:stretch>
+                      <a:fillRect/>
+                    </a:stretch>
+                  </pic:blipFill>
+                  <pic:spPr>
+                    <a:xfrm>
+                      <a:off x="0" y="0"/>
+                      <a:ext cx="4003738" cy="2514121"/>
+                    </a:xfrm>
+                    <a:prstGeom prst="rect">
+                      <a:avLst/>
+                    </a:prstGeom>
+                  </pic:spPr>
+                </pic:pic>
+              </a:graphicData>
+            </a:graphic>
+          </wp:inline>
+        </w:drawing>
+      </w:r>
+    </w:p>
+    <w:p>
+      <w:pPr>
+        <w:spacing w:line="480" w:lineRule="auto"/>
+      </w:pPr>
+      <w:r>
+        <w:t xml:space="preserve">Eso genera una alerta clínica y el </w:t>
+      </w:r>
+      <w:proofErr w:type="spellStart"/>
+      <w:r>
+        <w:rPr>
+          <w:rStyle w:val="CdigoHTML"/>
+          <w:rFonts w:ascii="Arial" w:hAnsi="Arial" w:cs="Arial"/>
+          <w:b/>
+          <w:bCs/>
+          <w:sz w:val="24"/>
+          <w:szCs w:val="24"/>
+        </w:rPr>
+        <w:t>ConsoleAlertNotifier</w:t>
+      </w:r>
+      <w:proofErr w:type="spellEnd"/>
+      <w:r>
+        <w:rPr>
+          <w:sz w:val="32"/>
+          <w:szCs w:val="32"/>
+        </w:rPr>
+        <w:t xml:space="preserve"> </w:t>
+      </w:r>
+      <w:r>
+        <w:t>usa el Bridge para enviar el mensaje por consola</w:t>
+      </w:r>
+      <w:r>
+        <w:t>:</w:t>
+      </w:r>
+    </w:p>
+    <w:p>
+      <w:pPr>
+        <w:spacing w:line="480" w:lineRule="auto"/>
+      </w:pPr>
+      <w:r>
+        <w:drawing>
+          <wp:inline distT="0" distB="0" distL="0" distR="0" wp14:anchorId="51B949B3" wp14:editId="0B515A78">
+            <wp:extent cx="5612130" cy="321945"/>
+            <wp:effectExtent l="0" t="0" r="7620" b="1905"/>
+            <wp:docPr id="338035806" name="Imagen 6"/>
+            <wp:cNvGraphicFramePr>
+              <a:graphicFrameLocks xmlns:a="http://schemas.openxmlformats.org/drawingml/2006/main" noChangeAspect="1"/>
+            </wp:cNvGraphicFramePr>
+            <a:graphic xmlns:a="http://schemas.openxmlformats.org/drawingml/2006/main">
+              <a:graphicData uri="http://schemas.openxmlformats.org/drawingml/2006/picture">
+                <pic:pic xmlns:pic="http://schemas.openxmlformats.org/drawingml/2006/picture">
+                  <pic:nvPicPr>
+                    <pic:cNvPr id="338035806" name=""/>
+                    <pic:cNvPicPr/>
+                  </pic:nvPicPr>
+                  <pic:blipFill>
+                    <a:blip r:embed="rId38"/>
+                    <a:stretch>
+                      <a:fillRect/>
+                    </a:stretch>
+                  </pic:blipFill>
+                  <pic:spPr>
+                    <a:xfrm>
+                      <a:off x="0" y="0"/>
+                      <a:ext cx="5612130" cy="321945"/>
+                    </a:xfrm>
+                    <a:prstGeom prst="rect">
+                      <a:avLst/>
+                    </a:prstGeom>
+                  </pic:spPr>
+                </pic:pic>
+              </a:graphicData>
+            </a:graphic>
+          </wp:inline>
+        </w:drawing>
+      </w:r>
+    </w:p>
+    <w:p>
+      <w:pPr>
+        <w:spacing w:line="480" w:lineRule="auto"/>
+      </w:pPr>
+      <w:r>
+        <w:t xml:space="preserve">Para hacer la prueba de </w:t>
+      </w:r>
+      <w:proofErr w:type="spellStart"/>
+      <w:r>
+        <w:t>IoT</w:t>
+      </w:r>
+      <w:proofErr w:type="spellEnd"/>
+      <w:r>
+        <w:t xml:space="preserve"> usaremos el siguiente </w:t>
+      </w:r>
+      <w:proofErr w:type="spellStart"/>
+      <w:r>
+        <w:t>endpoint</w:t>
+      </w:r>
+      <w:proofErr w:type="spellEnd"/>
+      <w:r>
+        <w:t xml:space="preserve">: </w:t>
+      </w:r>
+      <w:r>
+        <w:t xml:space="preserve">POST </w:t>
+      </w:r>
+      <w:proofErr w:type="spellStart"/>
+      <w:r>
+        <w:t>POST</w:t>
+      </w:r>
+      <w:proofErr w:type="spellEnd"/>
+      <w:r>
+        <w:t xml:space="preserve"> http://localhost:8080/api/iot/adapter/temperature</w:t>
+      </w:r>
+    </w:p>
+    <w:p>
+      <w:pPr>
+        <w:spacing w:line="480" w:lineRule="auto"/>
+      </w:pPr>
+      <w:r>
+        <w:drawing>
+          <wp:inline distT="0" distB="0" distL="0" distR="0" wp14:anchorId="6A532B04" wp14:editId="262273B4">
+            <wp:extent cx="4137660" cy="2396600"/>
+            <wp:effectExtent l="0" t="0" r="0" b="3810"/>
+            <wp:docPr id="1294981861" name="Imagen 5"/>
+            <wp:cNvGraphicFramePr>
+              <a:graphicFrameLocks xmlns:a="http://schemas.openxmlformats.org/drawingml/2006/main" noChangeAspect="1"/>
+            </wp:cNvGraphicFramePr>
+            <a:graphic xmlns:a="http://schemas.openxmlformats.org/drawingml/2006/main">
+              <a:graphicData uri="http://schemas.openxmlformats.org/drawingml/2006/picture">
+                <pic:pic xmlns:pic="http://schemas.openxmlformats.org/drawingml/2006/picture">
+                  <pic:nvPicPr>
+                    <pic:cNvPr id="1294981861" name=""/>
+                    <pic:cNvPicPr/>
+                  </pic:nvPicPr>
+                  <pic:blipFill>
+                    <a:blip r:embed="rId39"/>
+                    <a:stretch>
+                      <a:fillRect/>
+                    </a:stretch>
+                  </pic:blipFill>
+                  <pic:spPr>
+                    <a:xfrm>
+                      <a:off x="0" y="0"/>
+                      <a:ext cx="4140965" cy="2398514"/>
+                    </a:xfrm>
+                    <a:prstGeom prst="rect">
+                      <a:avLst/>
+                    </a:prstGeom>
+                  </pic:spPr>
+                </pic:pic>
+              </a:graphicData>
+            </a:graphic>
+          </wp:inline>
+        </w:drawing>
+      </w:r>
+    </w:p>
+    <w:p>
+      <w:pPr>
+        <w:spacing w:line="480" w:lineRule="auto"/>
+      </w:pPr>
+      <w:r>
+        <w:t>Nos arrojara una alerta en consola:</w:t>
+      </w:r>
+    </w:p>
+    <w:p>
+      <w:pPr>
+        <w:spacing w:line="480" w:lineRule="auto"/>
+      </w:pPr>
+      <w:r>
+        <w:lastRenderedPageBreak/>
+        <w:drawing>
+          <wp:inline distT="0" distB="0" distL="0" distR="0" wp14:anchorId="3B2C3141" wp14:editId="18EEE2EB">
+            <wp:extent cx="5612130" cy="419100"/>
+            <wp:effectExtent l="0" t="0" r="7620" b="0"/>
+            <wp:docPr id="127550139" name="Imagen 7"/>
+            <wp:cNvGraphicFramePr>
+              <a:graphicFrameLocks xmlns:a="http://schemas.openxmlformats.org/drawingml/2006/main" noChangeAspect="1"/>
+            </wp:cNvGraphicFramePr>
+            <a:graphic xmlns:a="http://schemas.openxmlformats.org/drawingml/2006/main">
+              <a:graphicData uri="http://schemas.openxmlformats.org/drawingml/2006/picture">
+                <pic:pic xmlns:pic="http://schemas.openxmlformats.org/drawingml/2006/picture">
+                  <pic:nvPicPr>
+                    <pic:cNvPr id="127550139" name=""/>
+                    <pic:cNvPicPr/>
+                  </pic:nvPicPr>
+                  <pic:blipFill>
+                    <a:blip r:embed="rId40"/>
+                    <a:stretch>
+                      <a:fillRect/>
+                    </a:stretch>
+                  </pic:blipFill>
+                  <pic:spPr>
+                    <a:xfrm>
+                      <a:off x="0" y="0"/>
+                      <a:ext cx="5612130" cy="419100"/>
+                    </a:xfrm>
+                    <a:prstGeom prst="rect">
+                      <a:avLst/>
+                    </a:prstGeom>
+                  </pic:spPr>
+                </pic:pic>
+              </a:graphicData>
+            </a:graphic>
+          </wp:inline>
+        </w:drawing>
+      </w:r>
+    </w:p>
+    <w:p>
+      <w:pPr>
+        <w:pStyle w:val="Ttulo1"/>
+        <w:numPr>
+          <w:ilvl w:val="1"/>
+          <w:numId w:val="10"/>
+        </w:numPr>
+      </w:pPr>
+      <w:r>
+        <w:t>Diagrama UML</w:t>
+      </w:r>
+    </w:p>
+    <w:p>
+      <w:pPr>
+        <w:spacing w:line="480" w:lineRule="auto"/>
+      </w:pPr>
+      <w:r>
+        <w:rPr>
+          <w:noProof/>
+        </w:rPr>
+        <w:drawing>
+          <wp:inline distT="0" distB="0" distL="0" distR="0">
+            <wp:extent cx="5612130" cy="2706370"/>
+            <wp:effectExtent l="0" t="0" r="7620" b="0"/>
+            <wp:docPr id="192432722" name="Imagen 8" descr="PlantUML Diagram"/>
+            <wp:cNvGraphicFramePr>
+              <a:graphicFrameLocks xmlns:a="http://schemas.openxmlformats.org/drawingml/2006/main" noChangeAspect="1"/>
+            </wp:cNvGraphicFramePr>
+            <a:graphic xmlns:a="http://schemas.openxmlformats.org/drawingml/2006/main">
+              <a:graphicData uri="http://schemas.openxmlformats.org/drawingml/2006/picture">
+                <pic:pic xmlns:pic="http://schemas.openxmlformats.org/drawingml/2006/picture">
+                  <pic:nvPicPr>
+                    <pic:cNvPr id="0" name="Picture 1" descr="PlantUML Diagram"/>
+                    <pic:cNvPicPr>
+                      <a:picLocks noChangeAspect="1" noChangeArrowheads="1"/>
+                    </pic:cNvPicPr>
+                  </pic:nvPicPr>
+                  <pic:blipFill>
+                    <a:blip r:embed="rId41">
+                      <a:extLst>
+                        <a:ext uri="{28A0092B-C50C-407E-A947-70E740481C1C}">
+                          <a14:useLocalDpi xmlns:a14="http://schemas.microsoft.com/office/drawing/2010/main" val="0"/>
+                        </a:ext>
+                      </a:extLst>
+                    </a:blip>
+                    <a:srcRect/>
+                    <a:stretch>
+                      <a:fillRect/>
+                    </a:stretch>
+                  </pic:blipFill>
+                  <pic:spPr bwMode="auto">
+                    <a:xfrm>
+                      <a:off x="0" y="0"/>
+                      <a:ext cx="5612130" cy="2706370"/>
+                    </a:xfrm>
+                    <a:prstGeom prst="rect">
+                      <a:avLst/>
+                    </a:prstGeom>
+                    <a:noFill/>
+                    <a:ln>
+                      <a:noFill/>
+                    </a:ln>
+                  </pic:spPr>
+                </pic:pic>
+              </a:graphicData>
+            </a:graphic>
+          </wp:inline>
+        </w:drawing>
+      </w:r>
+    </w:p>
+    <w:p>
+      <w:pPr>
+        <w:spacing w:line="480" w:lineRule="auto"/>
+        <w:ind w:left="708"/>
+        <w:jc w:val="both"/>
+      </w:pPr>
+      <w:r>
+        <w:t>E</w:t>
+      </w:r>
+      <w:r>
+        <w:t xml:space="preserve">l </w:t>
+      </w:r>
+      <w:r>
+        <w:t xml:space="preserve">diagrama </w:t>
+      </w:r>
+      <w:r>
+        <w:t xml:space="preserve">UML </w:t>
+      </w:r>
+      <w:r>
+        <w:t xml:space="preserve">muestra que </w:t>
+      </w:r>
+      <w:proofErr w:type="spellStart"/>
+      <w:r>
+        <w:rPr>
+          <w:b/>
+          <w:bCs/>
+        </w:rPr>
+        <w:t>AlertMessage</w:t>
+      </w:r>
+      <w:proofErr w:type="spellEnd"/>
+      <w:r>
+        <w:t xml:space="preserve"> es la parte que define qué alerta se va a enviar, mientras que </w:t>
+      </w:r>
+      <w:proofErr w:type="spellStart"/>
+      <w:r>
+        <w:rPr>
+          <w:b/>
+          <w:bCs/>
+        </w:rPr>
+        <w:t>AlertChannel</w:t>
+      </w:r>
+      <w:proofErr w:type="spellEnd"/>
+      <w:r>
+        <w:t xml:space="preserve"> define por dónde se envía.</w:t>
+      </w:r>
+      <w:r>
+        <w:br/>
+        <w:t xml:space="preserve">Las clases </w:t>
+      </w:r>
+      <w:proofErr w:type="spellStart"/>
+      <w:r>
+        <w:rPr>
+          <w:b/>
+          <w:bCs/>
+        </w:rPr>
+        <w:t>ClinicalAlertMessage</w:t>
+      </w:r>
+      <w:proofErr w:type="spellEnd"/>
+      <w:r>
+        <w:t xml:space="preserve"> e </w:t>
+      </w:r>
+      <w:proofErr w:type="spellStart"/>
+      <w:r>
+        <w:rPr>
+          <w:b/>
+          <w:bCs/>
+        </w:rPr>
+        <w:t>IoTAlertMessage</w:t>
+      </w:r>
+      <w:proofErr w:type="spellEnd"/>
+      <w:r>
+        <w:t xml:space="preserve"> representan tipos de alertas, y </w:t>
+      </w:r>
+      <w:proofErr w:type="spellStart"/>
+      <w:r>
+        <w:rPr>
+          <w:b/>
+          <w:bCs/>
+        </w:rPr>
+        <w:t>ConsoleAlertChannel</w:t>
+      </w:r>
+      <w:proofErr w:type="spellEnd"/>
+      <w:r>
+        <w:t xml:space="preserve"> y </w:t>
+      </w:r>
+      <w:proofErr w:type="spellStart"/>
+      <w:r>
+        <w:rPr>
+          <w:b/>
+          <w:bCs/>
+        </w:rPr>
+        <w:t>EmailAlertChannel</w:t>
+      </w:r>
+      <w:proofErr w:type="spellEnd"/>
+      <w:r>
+        <w:t xml:space="preserve"> representan los medios de envío.</w:t>
+      </w:r>
+    </w:p>
+    <w:p>
+      <w:pPr>
+        <w:spacing w:line="480" w:lineRule="auto"/>
+        <w:ind w:left="708"/>
+        <w:jc w:val="both"/>
+      </w:pPr>
+      <w:r>
+        <w:t xml:space="preserve">La idea del </w:t>
+      </w:r>
+      <w:r>
+        <w:rPr>
+          <w:b/>
+          <w:bCs/>
+        </w:rPr>
+        <w:t>Bridge</w:t>
+      </w:r>
+      <w:r>
+        <w:t xml:space="preserve"> es que ambos lados se pueden cambiar de forma independiente.</w:t>
+      </w:r>
+    </w:p>
+    <w:p>
+      <w:pPr>
+        <w:spacing w:line="480" w:lineRule="auto"/>
+        <w:ind w:left="708"/>
+        <w:jc w:val="both"/>
+      </w:pPr>
+    </w:p>
+    <w:p>
+      <w:pPr>
+        <w:spacing w:line="480" w:lineRule="auto"/>
+        <w:ind w:left="708"/>
+        <w:jc w:val="both"/>
+      </w:pPr>
+    </w:p>
+    <w:p>
+      <w:pPr>
+        <w:spacing w:line="480" w:lineRule="auto"/>
+        <w:ind w:left="708"/>
+        <w:jc w:val="both"/>
+      </w:pPr>
+    </w:p>
+    <w:p>
+      <w:pPr>
+        <w:spacing w:line="480" w:lineRule="auto"/>
+        <w:ind w:left="708"/>
+        <w:jc w:val="both"/>
+      </w:pPr>
+    </w:p>
+    <w:p>
+      <w:pPr>
+        <w:pStyle w:val="Ttulo1"/>
+        <w:numPr>
+          <w:ilvl w:val="0"/>
+          <w:numId w:val="10"/>
+        </w:numPr>
+        <w:spacing w:line="480" w:lineRule="auto"/>
+      </w:pPr>
+      <w:r>
+        <w:lastRenderedPageBreak/>
+        <w:t xml:space="preserve">Patrón </w:t>
+      </w:r>
+      <w:proofErr w:type="spellStart"/>
+      <w:r>
+        <w:t>Decorator</w:t>
+      </w:r>
+      <w:proofErr w:type="spellEnd"/>
+    </w:p>
+    <w:p>
+      <w:pPr>
+        <w:pStyle w:val="Ttulo1"/>
+        <w:numPr>
+          <w:ilvl w:val="1"/>
+          <w:numId w:val="10"/>
+        </w:numPr>
+        <w:spacing w:line="480" w:lineRule="auto"/>
+      </w:pPr>
+      <w:r>
+        <w:t xml:space="preserve">Análisis para la aplicación del </w:t>
+      </w:r>
+      <w:proofErr w:type="spellStart"/>
+      <w:r>
+        <w:t>Decorator</w:t>
+      </w:r>
+      <w:proofErr w:type="spellEnd"/>
+    </w:p>
+    <w:p>
+      <w:pPr>
+        <w:spacing w:line="480" w:lineRule="auto"/>
+      </w:pPr>
+      <w:r>
+        <w:rPr>
+          <w:rFonts w:cs="Arial"/>
+          <w:b/>
+          <w:bCs/>
+        </w:rPr>
+        <w:t xml:space="preserve">Objetivo del patrón: </w:t>
+      </w:r>
+      <w:r>
+        <w:t>Permitir agregar nuevas funciones a un objeto sin modificar su código original.</w:t>
+      </w:r>
+    </w:p>
+    <w:p>
+      <w:pPr>
+        <w:pStyle w:val="NormalWeb"/>
+        <w:spacing w:line="480" w:lineRule="auto"/>
+        <w:jc w:val="both"/>
+        <w:rPr>
+          <w:rFonts w:cs="Arial"/>
+        </w:rPr>
+      </w:pPr>
+      <w:r>
+        <w:rPr>
+          <w:rFonts w:cs="Arial"/>
+          <w:b/>
+          <w:bCs/>
+        </w:rPr>
+        <w:t>Motivación en el proyecto:</w:t>
+      </w:r>
+      <w:r>
+        <w:rPr>
+          <w:rFonts w:cs="Arial"/>
+        </w:rPr>
+        <w:t xml:space="preserve"> </w:t>
+      </w:r>
+      <w:r>
+        <w:rPr>
+          <w:rFonts w:cs="Arial"/>
+        </w:rPr>
+        <w:t>En tu sistema ya existe una forma de notificar alertas. Pero a veces quieres que esa notificación tenga información adicional, por ejemplo:</w:t>
+      </w:r>
+    </w:p>
+    <w:p>
+      <w:pPr>
+        <w:numPr>
+          <w:ilvl w:val="0"/>
+          <w:numId w:val="15"/>
+        </w:numPr>
+        <w:spacing w:before="100" w:beforeAutospacing="1" w:after="100" w:afterAutospacing="1" w:line="480" w:lineRule="auto"/>
+        <w:jc w:val="both"/>
+        <w:rPr>
+          <w:rFonts w:cs="Arial"/>
+        </w:rPr>
+      </w:pPr>
+      <w:r>
+        <w:rPr>
+          <w:rFonts w:cs="Arial"/>
+        </w:rPr>
+        <w:t>L</w:t>
+      </w:r>
+      <w:r>
+        <w:rPr>
+          <w:rFonts w:cs="Arial"/>
+        </w:rPr>
+        <w:t xml:space="preserve">a severidad </w:t>
+      </w:r>
+    </w:p>
+    <w:p>
+      <w:pPr>
+        <w:numPr>
+          <w:ilvl w:val="0"/>
+          <w:numId w:val="15"/>
+        </w:numPr>
+        <w:spacing w:before="100" w:beforeAutospacing="1" w:after="100" w:afterAutospacing="1" w:line="480" w:lineRule="auto"/>
+        <w:jc w:val="both"/>
+        <w:rPr>
+          <w:rFonts w:cs="Arial"/>
+        </w:rPr>
+      </w:pPr>
+      <w:r>
+        <w:rPr>
+          <w:rFonts w:cs="Arial"/>
+        </w:rPr>
+        <w:t>L</w:t>
+      </w:r>
+      <w:r>
+        <w:rPr>
+          <w:rFonts w:cs="Arial"/>
+        </w:rPr>
+        <w:t xml:space="preserve">a hora en que se generó </w:t>
+      </w:r>
+    </w:p>
+    <w:p>
+      <w:pPr>
+        <w:numPr>
+          <w:ilvl w:val="0"/>
+          <w:numId w:val="15"/>
+        </w:numPr>
+        <w:spacing w:before="100" w:beforeAutospacing="1" w:after="100" w:afterAutospacing="1" w:line="480" w:lineRule="auto"/>
+        <w:jc w:val="both"/>
+        <w:rPr>
+          <w:rFonts w:cs="Arial"/>
+        </w:rPr>
+      </w:pPr>
+      <w:r>
+        <w:rPr>
+          <w:rFonts w:cs="Arial"/>
+        </w:rPr>
+        <w:t>D</w:t>
+      </w:r>
+      <w:r>
+        <w:rPr>
+          <w:rFonts w:cs="Arial"/>
+        </w:rPr>
+        <w:t xml:space="preserve">atos extra del contexto </w:t>
+      </w:r>
+    </w:p>
+    <w:p>
+      <w:pPr>
+        <w:spacing w:before="100" w:beforeAutospacing="1" w:after="100" w:afterAutospacing="1" w:line="480" w:lineRule="auto"/>
+        <w:ind w:firstLine="708"/>
+        <w:jc w:val="both"/>
+        <w:rPr>
+          <w:rFonts w:cs="Arial"/>
+        </w:rPr>
+      </w:pPr>
+      <w:r>
+        <w:rPr>
+          <w:rFonts w:cs="Arial"/>
+        </w:rPr>
+        <w:t xml:space="preserve">Con </w:t>
+      </w:r>
+      <w:proofErr w:type="spellStart"/>
+      <w:r>
+        <w:rPr>
+          <w:rFonts w:cs="Arial"/>
+          <w:b/>
+          <w:bCs/>
+        </w:rPr>
+        <w:t>Decorator</w:t>
+      </w:r>
+      <w:proofErr w:type="spellEnd"/>
+      <w:r>
+        <w:rPr>
+          <w:rFonts w:cs="Arial"/>
+        </w:rPr>
+        <w:t>, en lugar de cambiar la clase base, le agregas esas funciones por encima.</w:t>
+      </w:r>
+      <w:r>
+        <w:rPr>
+          <w:rFonts w:cs="Arial"/>
+        </w:rPr>
+        <w:t xml:space="preserve"> </w:t>
+      </w:r>
+      <w:r>
+        <w:rPr>
+          <w:rFonts w:cs="Arial"/>
+        </w:rPr>
+        <w:t>Eso hace que el sistema sea más flexible y fácil de mantener.</w:t>
+      </w:r>
+    </w:p>
+    <w:p>
+      <w:pPr>
+        <w:pStyle w:val="Ttulo1"/>
+        <w:numPr>
+          <w:ilvl w:val="1"/>
+          <w:numId w:val="10"/>
+        </w:numPr>
+      </w:pPr>
+      <w:r>
+        <w:t xml:space="preserve">Aplicación del patrón </w:t>
+      </w:r>
+      <w:proofErr w:type="spellStart"/>
+      <w:r>
+        <w:t>Decorator</w:t>
+      </w:r>
+      <w:proofErr w:type="spellEnd"/>
+    </w:p>
+    <w:p>
+      <w:pPr>
+        <w:pStyle w:val="Ttulo1"/>
+        <w:numPr>
+          <w:ilvl w:val="0"/>
+          <w:numId w:val="0"/>
+        </w:numPr>
+        <w:ind w:left="360"/>
+        <w:rPr>
+          <w:b w:val="0"/>
+          <w:bCs w:val="0"/>
+        </w:rPr>
+      </w:pPr>
+      <w:r>
+        <w:rPr>
+          <w:rFonts w:cs="Arial"/>
+        </w:rPr>
+        <w:t xml:space="preserve">Clase </w:t>
+      </w:r>
+      <w:proofErr w:type="spellStart"/>
+      <w:r>
+        <w:rPr>
+          <w:rFonts w:cs="Arial"/>
+        </w:rPr>
+        <w:t>ConsoleAlertNotifier</w:t>
+      </w:r>
+      <w:proofErr w:type="spellEnd"/>
+      <w:r>
+        <w:rPr>
+          <w:rFonts w:cs="Arial"/>
+        </w:rPr>
+        <w:t xml:space="preserve"> </w:t>
+      </w:r>
+      <w:r>
+        <w:rPr>
+          <w:b w:val="0"/>
+          <w:bCs w:val="0"/>
+        </w:rPr>
+        <w:t>muestra la alerta en consola.</w:t>
+      </w:r>
+    </w:p>
+    <w:p>
+      <w:pPr>
+        <w:pStyle w:val="Ttulo1"/>
+        <w:numPr>
+          <w:ilvl w:val="0"/>
+          <w:numId w:val="0"/>
+        </w:numPr>
+        <w:ind w:left="360"/>
+      </w:pPr>
+      <w:r>
+        <w:rPr>
+          <w:rFonts w:cs="Arial"/>
+        </w:rPr>
+        <w:drawing>
+          <wp:inline distT="0" distB="0" distL="0" distR="0" wp14:anchorId="118DF10F" wp14:editId="0D658B2B">
+            <wp:extent cx="5612130" cy="2392680"/>
+            <wp:effectExtent l="0" t="0" r="7620" b="7620"/>
+            <wp:docPr id="238244691" name="Imagen 9"/>
+            <wp:cNvGraphicFramePr>
+              <a:graphicFrameLocks xmlns:a="http://schemas.openxmlformats.org/drawingml/2006/main" noChangeAspect="1"/>
+            </wp:cNvGraphicFramePr>
+            <a:graphic xmlns:a="http://schemas.openxmlformats.org/drawingml/2006/main">
+              <a:graphicData uri="http://schemas.openxmlformats.org/drawingml/2006/picture">
+                <pic:pic xmlns:pic="http://schemas.openxmlformats.org/drawingml/2006/picture">
+                  <pic:nvPicPr>
+                    <pic:cNvPr id="1116251395" name=""/>
+                    <pic:cNvPicPr/>
+                  </pic:nvPicPr>
+                  <pic:blipFill>
+                    <a:blip r:embed="rId35"/>
+                    <a:stretch>
+                      <a:fillRect/>
+                    </a:stretch>
+                  </pic:blipFill>
+                  <pic:spPr>
+                    <a:xfrm>
+                      <a:off x="0" y="0"/>
+                      <a:ext cx="5612130" cy="2392680"/>
+                    </a:xfrm>
+                    <a:prstGeom prst="rect">
+                      <a:avLst/>
+                    </a:prstGeom>
+                  </pic:spPr>
+                </pic:pic>
+              </a:graphicData>
+            </a:graphic>
+          </wp:inline>
+        </w:drawing>
+      </w:r>
+    </w:p>
+    <w:p>
+      <w:pPr>
+        <w:pStyle w:val="Ttulo1"/>
+        <w:numPr>
+          <w:ilvl w:val="0"/>
+          <w:numId w:val="0"/>
+        </w:numPr>
+        <w:ind w:left="360"/>
+      </w:pPr>
+      <w:r>
+        <w:lastRenderedPageBreak/>
+        <w:t xml:space="preserve">Clase </w:t>
+      </w:r>
+      <w:proofErr w:type="spellStart"/>
+      <w:r>
+        <w:t>TimestampAlertNotifierDecorator</w:t>
+      </w:r>
+      <w:proofErr w:type="spellEnd"/>
+    </w:p>
+    <w:p>
+      <w:pPr>
+        <w:pStyle w:val="Ttulo1"/>
+        <w:numPr>
+          <w:ilvl w:val="0"/>
+          <w:numId w:val="0"/>
+        </w:numPr>
+        <w:ind w:left="360"/>
+      </w:pPr>
+      <w:r>
+        <w:drawing>
+          <wp:inline distT="0" distB="0" distL="0" distR="0" wp14:anchorId="371734A4" wp14:editId="6E9098CA">
+            <wp:extent cx="5612130" cy="3219450"/>
+            <wp:effectExtent l="0" t="0" r="7620" b="0"/>
+            <wp:docPr id="800817956" name="Imagen 10"/>
+            <wp:cNvGraphicFramePr>
+              <a:graphicFrameLocks xmlns:a="http://schemas.openxmlformats.org/drawingml/2006/main" noChangeAspect="1"/>
+            </wp:cNvGraphicFramePr>
+            <a:graphic xmlns:a="http://schemas.openxmlformats.org/drawingml/2006/main">
+              <a:graphicData uri="http://schemas.openxmlformats.org/drawingml/2006/picture">
+                <pic:pic xmlns:pic="http://schemas.openxmlformats.org/drawingml/2006/picture">
+                  <pic:nvPicPr>
+                    <pic:cNvPr id="800817956" name=""/>
+                    <pic:cNvPicPr/>
+                  </pic:nvPicPr>
+                  <pic:blipFill>
+                    <a:blip r:embed="rId42"/>
+                    <a:stretch>
+                      <a:fillRect/>
+                    </a:stretch>
+                  </pic:blipFill>
+                  <pic:spPr>
+                    <a:xfrm>
+                      <a:off x="0" y="0"/>
+                      <a:ext cx="5612130" cy="3219450"/>
+                    </a:xfrm>
+                    <a:prstGeom prst="rect">
+                      <a:avLst/>
+                    </a:prstGeom>
+                  </pic:spPr>
+                </pic:pic>
+              </a:graphicData>
+            </a:graphic>
+          </wp:inline>
+        </w:drawing>
+      </w:r>
+    </w:p>
+    <w:p>
+      <w:pPr>
+        <w:pStyle w:val="Ttulo1"/>
+        <w:numPr>
+          <w:ilvl w:val="0"/>
+          <w:numId w:val="0"/>
+        </w:numPr>
+        <w:ind w:left="360"/>
+      </w:pPr>
+      <w:r>
+        <w:t xml:space="preserve">Clase </w:t>
+      </w:r>
+      <w:proofErr w:type="spellStart"/>
+      <w:r>
+        <w:t>SeverityAlertNotifierDecorator</w:t>
+      </w:r>
+      <w:proofErr w:type="spellEnd"/>
+    </w:p>
+    <w:p>
+      <w:pPr>
+        <w:pStyle w:val="Ttulo1"/>
+        <w:numPr>
+          <w:ilvl w:val="0"/>
+          <w:numId w:val="0"/>
+        </w:numPr>
+        <w:ind w:left="360"/>
+      </w:pPr>
+      <w:r>
+        <w:drawing>
+          <wp:inline distT="0" distB="0" distL="0" distR="0" wp14:anchorId="5A231CC7" wp14:editId="52533B57">
+            <wp:extent cx="5612130" cy="2943225"/>
+            <wp:effectExtent l="0" t="0" r="7620" b="9525"/>
+            <wp:docPr id="265480732" name="Imagen 11"/>
+            <wp:cNvGraphicFramePr>
+              <a:graphicFrameLocks xmlns:a="http://schemas.openxmlformats.org/drawingml/2006/main" noChangeAspect="1"/>
+            </wp:cNvGraphicFramePr>
+            <a:graphic xmlns:a="http://schemas.openxmlformats.org/drawingml/2006/main">
+              <a:graphicData uri="http://schemas.openxmlformats.org/drawingml/2006/picture">
+                <pic:pic xmlns:pic="http://schemas.openxmlformats.org/drawingml/2006/picture">
+                  <pic:nvPicPr>
+                    <pic:cNvPr id="265480732" name=""/>
+                    <pic:cNvPicPr/>
+                  </pic:nvPicPr>
+                  <pic:blipFill>
+                    <a:blip r:embed="rId43"/>
+                    <a:stretch>
+                      <a:fillRect/>
+                    </a:stretch>
+                  </pic:blipFill>
+                  <pic:spPr>
+                    <a:xfrm>
+                      <a:off x="0" y="0"/>
+                      <a:ext cx="5612130" cy="2943225"/>
+                    </a:xfrm>
+                    <a:prstGeom prst="rect">
+                      <a:avLst/>
+                    </a:prstGeom>
+                  </pic:spPr>
+                </pic:pic>
+              </a:graphicData>
+            </a:graphic>
+          </wp:inline>
+        </w:drawing>
+      </w:r>
+    </w:p>
+    <w:p>
+      <w:pPr>
+        <w:pStyle w:val="NormalWeb"/>
+        <w:spacing w:line="480" w:lineRule="auto"/>
+        <w:jc w:val="both"/>
+        <w:rPr>
+          <w:rFonts w:cs="Arial"/>
+        </w:rPr>
+      </w:pPr>
+      <w:r>
+        <w:rPr>
+          <w:rFonts w:cs="Arial"/>
+        </w:rPr>
+        <w:t>L</w:t>
+      </w:r>
+      <w:r>
+        <w:rPr>
+          <w:rFonts w:cs="Arial"/>
+        </w:rPr>
+        <w:t xml:space="preserve">os cuales </w:t>
+      </w:r>
+      <w:r>
+        <w:rPr>
+          <w:rFonts w:cs="Arial"/>
+        </w:rPr>
+        <w:t xml:space="preserve">son decoradores que </w:t>
+      </w:r>
+      <w:r>
+        <w:rPr>
+          <w:rFonts w:cs="Arial"/>
+        </w:rPr>
+        <w:t>envuelven al notificador original y agregan datos extra como la hora de notificación y la severidad de la alerta.</w:t>
+      </w:r>
+      <w:r>
+        <w:rPr>
+          <w:rFonts w:cs="Arial"/>
+        </w:rPr>
+        <w:t xml:space="preserve"> </w:t>
+      </w:r>
+      <w:r>
+        <w:rPr>
+          <w:rFonts w:cs="Arial"/>
+        </w:rPr>
+        <w:t xml:space="preserve">De esta forma, </w:t>
+      </w:r>
+      <w:r>
+        <w:rPr>
+          <w:rFonts w:cs="Arial"/>
+        </w:rPr>
+        <w:lastRenderedPageBreak/>
+        <w:t xml:space="preserve">el sistema puede extender el comportamiento de las alertas sin modificar el código existente, cumpliendo el objetivo del patrón </w:t>
+      </w:r>
+      <w:proofErr w:type="spellStart"/>
+      <w:r>
+        <w:rPr>
+          <w:rFonts w:cs="Arial"/>
+          <w:b/>
+          <w:bCs/>
+        </w:rPr>
+        <w:t>Decorator</w:t>
+      </w:r>
+      <w:proofErr w:type="spellEnd"/>
+      <w:r>
+        <w:rPr>
+          <w:rFonts w:cs="Arial"/>
+        </w:rPr>
+        <w:t>.</w:t>
+      </w:r>
+    </w:p>
+    <w:p>
+      <w:pPr>
+        <w:pStyle w:val="NormalWeb"/>
+        <w:spacing w:line="480" w:lineRule="auto"/>
+        <w:jc w:val="both"/>
+        <w:rPr>
+          <w:rFonts w:cs="Arial"/>
+        </w:rPr>
+      </w:pPr>
+      <w:r>
+        <w:t xml:space="preserve">El </w:t>
+      </w:r>
+      <w:proofErr w:type="spellStart"/>
+      <w:r>
+        <w:rPr>
+          <w:b/>
+          <w:bCs/>
+        </w:rPr>
+        <w:t>Decorator</w:t>
+      </w:r>
+      <w:proofErr w:type="spellEnd"/>
+      <w:r>
+        <w:t xml:space="preserve"> lo usé para agregar información extra a la notificación sin modificar la clase base. Primero se envía la alerta normal y luego los decoradores le agregan cosas como la hora y la severidad. Así puedo extender el comportamiento sin cambiar el código original.</w:t>
+      </w:r>
+    </w:p>
+    <w:p>
+      <w:pPr>
+        <w:pStyle w:val="Ttulo1"/>
+        <w:numPr>
+          <w:ilvl w:val="1"/>
+          <w:numId w:val="10"/>
+        </w:numPr>
+      </w:pPr>
+      <w:r>
+        <w:t>Pruebas de funcionalidad</w:t>
+      </w:r>
+    </w:p>
+    <w:p>
+      <w:pPr>
+        <w:spacing w:line="480" w:lineRule="auto"/>
+      </w:pPr>
+      <w:r>
+        <w:t>Creamos una prescripción para que se genere la alerta</w:t>
+      </w:r>
+    </w:p>
+    <w:p>
+      <w:pPr>
+        <w:spacing w:line="480" w:lineRule="auto"/>
+      </w:pPr>
+      <w:r>
+        <w:drawing>
+          <wp:inline distT="0" distB="0" distL="0" distR="0" wp14:anchorId="600A8966" wp14:editId="66B4AD29">
+            <wp:extent cx="3906047" cy="2446020"/>
+            <wp:effectExtent l="0" t="0" r="0" b="0"/>
+            <wp:docPr id="1774811520" name="Imagen 12"/>
+            <wp:cNvGraphicFramePr>
+              <a:graphicFrameLocks xmlns:a="http://schemas.openxmlformats.org/drawingml/2006/main" noChangeAspect="1"/>
+            </wp:cNvGraphicFramePr>
+            <a:graphic xmlns:a="http://schemas.openxmlformats.org/drawingml/2006/main">
+              <a:graphicData uri="http://schemas.openxmlformats.org/drawingml/2006/picture">
+                <pic:pic xmlns:pic="http://schemas.openxmlformats.org/drawingml/2006/picture">
+                  <pic:nvPicPr>
+                    <pic:cNvPr id="1774811520" name=""/>
+                    <pic:cNvPicPr/>
+                  </pic:nvPicPr>
+                  <pic:blipFill>
+                    <a:blip r:embed="rId44"/>
+                    <a:stretch>
+                      <a:fillRect/>
+                    </a:stretch>
+                  </pic:blipFill>
+                  <pic:spPr>
+                    <a:xfrm>
+                      <a:off x="0" y="0"/>
+                      <a:ext cx="3909225" cy="2448010"/>
+                    </a:xfrm>
+                    <a:prstGeom prst="rect">
+                      <a:avLst/>
+                    </a:prstGeom>
+                  </pic:spPr>
+                </pic:pic>
+              </a:graphicData>
+            </a:graphic>
+          </wp:inline>
+        </w:drawing>
+      </w:r>
+    </w:p>
+    <w:p>
+      <w:pPr>
+        <w:spacing w:line="480" w:lineRule="auto"/>
+      </w:pPr>
+      <w:r>
+        <w:t xml:space="preserve">En consola </w:t>
+      </w:r>
+      <w:r>
+        <w:t>aparecerá lo siguiente en consola:</w:t>
+      </w:r>
+    </w:p>
+    <w:p>
+      <w:pPr>
+        <w:spacing w:line="480" w:lineRule="auto"/>
+      </w:pPr>
+      <w:r>
+        <w:drawing>
+          <wp:inline distT="0" distB="0" distL="0" distR="0" wp14:anchorId="74B2C2D8" wp14:editId="542FB53A">
+            <wp:extent cx="5612130" cy="648335"/>
+            <wp:effectExtent l="0" t="0" r="7620" b="0"/>
+            <wp:docPr id="326094242" name="Imagen 13"/>
+            <wp:cNvGraphicFramePr>
+              <a:graphicFrameLocks xmlns:a="http://schemas.openxmlformats.org/drawingml/2006/main" noChangeAspect="1"/>
+            </wp:cNvGraphicFramePr>
+            <a:graphic xmlns:a="http://schemas.openxmlformats.org/drawingml/2006/main">
+              <a:graphicData uri="http://schemas.openxmlformats.org/drawingml/2006/picture">
+                <pic:pic xmlns:pic="http://schemas.openxmlformats.org/drawingml/2006/picture">
+                  <pic:nvPicPr>
+                    <pic:cNvPr id="326094242" name=""/>
+                    <pic:cNvPicPr/>
+                  </pic:nvPicPr>
+                  <pic:blipFill>
+                    <a:blip r:embed="rId45"/>
+                    <a:stretch>
+                      <a:fillRect/>
+                    </a:stretch>
+                  </pic:blipFill>
+                  <pic:spPr>
+                    <a:xfrm>
+                      <a:off x="0" y="0"/>
+                      <a:ext cx="5612130" cy="648335"/>
+                    </a:xfrm>
+                    <a:prstGeom prst="rect">
+                      <a:avLst/>
+                    </a:prstGeom>
+                  </pic:spPr>
+                </pic:pic>
+              </a:graphicData>
+            </a:graphic>
+          </wp:inline>
+        </w:drawing>
+      </w:r>
+    </w:p>
+    <w:p>
+      <w:pPr>
+        <w:spacing w:line="480" w:lineRule="auto"/>
+        <w:ind w:left="708"/>
+        <w:jc w:val="both"/>
+      </w:pPr>
+      <w:r>
+        <w:t xml:space="preserve">Eso demuestra que el </w:t>
+      </w:r>
+      <w:proofErr w:type="spellStart"/>
+      <w:r>
+        <w:t>Decorator</w:t>
+      </w:r>
+      <w:proofErr w:type="spellEnd"/>
+      <w:r>
+        <w:t xml:space="preserve"> está funcionando porque la notificación base ahora tiene comportamiento adicional.</w:t>
+      </w:r>
+    </w:p>
+    <w:p>
+      <w:pPr>
+        <w:pStyle w:val="NormalWeb"/>
+        <w:spacing w:line="480" w:lineRule="auto"/>
+        <w:jc w:val="both"/>
+        <w:rPr>
+          <w:rFonts w:cs="Arial"/>
+        </w:rPr>
+      </w:pPr>
+    </w:p>
+    <w:p>
+      <w:pPr>
+        <w:pStyle w:val="Ttulo1"/>
+        <w:numPr>
+          <w:ilvl w:val="1"/>
+          <w:numId w:val="10"/>
+        </w:numPr>
+      </w:pPr>
+      <w:r>
+        <w:lastRenderedPageBreak/>
+        <w:t>Diagrama UML</w:t>
+      </w:r>
+    </w:p>
+    <w:p>
+      <w:pPr>
+        <w:pStyle w:val="Ttulo1"/>
+        <w:numPr>
+          <w:ilvl w:val="0"/>
+          <w:numId w:val="0"/>
+        </w:numPr>
+        <w:spacing w:line="480" w:lineRule="auto"/>
+      </w:pPr>
+      <w:r>
+        <w:rPr>
+          <w:noProof/>
+        </w:rPr>
+        <w:drawing>
+          <wp:inline distT="0" distB="0" distL="0" distR="0">
+            <wp:extent cx="4906379" cy="2628900"/>
+            <wp:effectExtent l="0" t="0" r="8890" b="0"/>
+            <wp:docPr id="1444722700" name="Imagen 14" descr="PlantUML Diagram"/>
+            <wp:cNvGraphicFramePr>
+              <a:graphicFrameLocks xmlns:a="http://schemas.openxmlformats.org/drawingml/2006/main" noChangeAspect="1"/>
+            </wp:cNvGraphicFramePr>
+            <a:graphic xmlns:a="http://schemas.openxmlformats.org/drawingml/2006/main">
+              <a:graphicData uri="http://schemas.openxmlformats.org/drawingml/2006/picture">
+                <pic:pic xmlns:pic="http://schemas.openxmlformats.org/drawingml/2006/picture">
+                  <pic:nvPicPr>
+                    <pic:cNvPr id="0" name="Picture 3" descr="PlantUML Diagram"/>
+                    <pic:cNvPicPr>
+                      <a:picLocks noChangeAspect="1" noChangeArrowheads="1"/>
+                    </pic:cNvPicPr>
+                  </pic:nvPicPr>
+                  <pic:blipFill>
+                    <a:blip r:embed="rId46">
+                      <a:extLst>
+                        <a:ext uri="{28A0092B-C50C-407E-A947-70E740481C1C}">
+                          <a14:useLocalDpi xmlns:a14="http://schemas.microsoft.com/office/drawing/2010/main" val="0"/>
+                        </a:ext>
+                      </a:extLst>
+                    </a:blip>
+                    <a:srcRect/>
+                    <a:stretch>
+                      <a:fillRect/>
+                    </a:stretch>
+                  </pic:blipFill>
+                  <pic:spPr bwMode="auto">
+                    <a:xfrm>
+                      <a:off x="0" y="0"/>
+                      <a:ext cx="4909806" cy="2630736"/>
+                    </a:xfrm>
+                    <a:prstGeom prst="rect">
+                      <a:avLst/>
+                    </a:prstGeom>
+                    <a:noFill/>
+                    <a:ln>
+                      <a:noFill/>
+                    </a:ln>
+                  </pic:spPr>
+                </pic:pic>
+              </a:graphicData>
+            </a:graphic>
+          </wp:inline>
+        </w:drawing>
+      </w:r>
+    </w:p>
+    <w:p>
+      <w:pPr>
+        <w:spacing w:line="480" w:lineRule="auto"/>
+        <w:jc w:val="both"/>
+      </w:pPr>
+      <w:r>
+        <w:t xml:space="preserve">Este diagrama muestra que </w:t>
+      </w:r>
+      <w:proofErr w:type="spellStart"/>
+      <w:r>
+        <w:rPr>
+          <w:b/>
+          <w:bCs/>
+        </w:rPr>
+        <w:t>AlertNotifier</w:t>
+      </w:r>
+      <w:proofErr w:type="spellEnd"/>
+      <w:r>
+        <w:t xml:space="preserve"> es la interfaz principal.</w:t>
+      </w:r>
+      <w:r>
+        <w:br/>
+      </w:r>
+      <w:proofErr w:type="spellStart"/>
+      <w:r>
+        <w:rPr>
+          <w:b/>
+          <w:bCs/>
+        </w:rPr>
+        <w:t>ConsoleAlertNotifier</w:t>
+      </w:r>
+      <w:proofErr w:type="spellEnd"/>
+      <w:r>
+        <w:t xml:space="preserve"> es la notificación base.</w:t>
+      </w:r>
+    </w:p>
+    <w:p>
+      <w:pPr>
+        <w:spacing w:line="480" w:lineRule="auto"/>
+        <w:jc w:val="both"/>
+      </w:pPr>
+      <w:proofErr w:type="spellStart"/>
+      <w:r>
+        <w:rPr>
+          <w:b/>
+          <w:bCs/>
+        </w:rPr>
+        <w:t>AlertNotifierDecorator</w:t>
+      </w:r>
+      <w:proofErr w:type="spellEnd"/>
+      <w:r>
+        <w:t xml:space="preserve"> actúa como envoltorio y permite agregar comportamiento extra.</w:t>
+      </w:r>
+    </w:p>
+    <w:p>
+      <w:pPr>
+        <w:spacing w:line="480" w:lineRule="auto"/>
+        <w:jc w:val="both"/>
+      </w:pPr>
+      <w:proofErr w:type="spellStart"/>
+      <w:r>
+        <w:rPr>
+          <w:b/>
+          <w:bCs/>
+        </w:rPr>
+        <w:t>TimestampAlertNotifierDecorator</w:t>
+      </w:r>
+      <w:proofErr w:type="spellEnd"/>
+      <w:r>
+        <w:t xml:space="preserve"> y </w:t>
+      </w:r>
+      <w:proofErr w:type="spellStart"/>
+      <w:r>
+        <w:rPr>
+          <w:b/>
+          <w:bCs/>
+        </w:rPr>
+        <w:t>SeverityAlertNotifierDecorator</w:t>
+      </w:r>
+      <w:proofErr w:type="spellEnd"/>
+      <w:r>
+        <w:t xml:space="preserve"> son decoradores concretos que amplían la notificación sin cambiar la clase original.</w:t>
+      </w:r>
+    </w:p>
+    <w:p>
+      <w:pPr>
+        <w:spacing w:line="480" w:lineRule="auto"/>
+      </w:pPr>
+    </w:p>
+    <w:p>
+      <w:pPr>
+        <w:spacing w:line="480" w:lineRule="auto"/>
+      </w:pPr>
+    </w:p>
     <w:sectPr>
-      <w:footerReference w:type="default" r:id="rId34"/>
+      <w:footerReference w:type="default" r:id="rId47"/>
       <w:pgSz w:w="12240" w:h="15840"/>
       <w:pgMar w:top="1418" w:right="1701" w:bottom="1418" w:left="1701" w:header="709" w:footer="709" w:gutter="0"/>
       <w:pgNumType w:start="0"/>
@@ -33722,6 +35754,155 @@
     </w:lvl>
   </w:abstractNum>
   <w:abstractNum w:abstractNumId="1" w15:restartNumberingAfterBreak="0">
+    <w:nsid w:val="0DAC36C2"/>
+    <w:multiLevelType w:val="multilevel"/>
+    <w:tmpl w:val="DDD4D078"/>
+    <w:lvl w:ilvl="0">
+      <w:start w:val="1"/>
+      <w:numFmt w:val="bullet"/>
+      <w:lvlText w:val=""/>
+      <w:lvlJc w:val="left"/>
+      <w:pPr>
+        <w:tabs>
+          <w:tab w:val="num" w:pos="720"/>
+        </w:tabs>
+        <w:ind w:left="720" w:hanging="360"/>
+      </w:pPr>
+      <w:rPr>
+        <w:rFonts w:ascii="Symbol" w:hAnsi="Symbol" w:hint="default"/>
+        <w:sz w:val="20"/>
+      </w:rPr>
+    </w:lvl>
+    <w:lvl w:ilvl="1" w:tentative="1">
+      <w:start w:val="1"/>
+      <w:numFmt w:val="bullet"/>
+      <w:lvlText w:val="o"/>
+      <w:lvlJc w:val="left"/>
+      <w:pPr>
+        <w:tabs>
+          <w:tab w:val="num" w:pos="1440"/>
+        </w:tabs>
+        <w:ind w:left="1440" w:hanging="360"/>
+      </w:pPr>
+      <w:rPr>
+        <w:rFonts w:ascii="Courier New" w:hAnsi="Courier New" w:hint="default"/>
+        <w:sz w:val="20"/>
+      </w:rPr>
+    </w:lvl>
+    <w:lvl w:ilvl="2" w:tentative="1">
+      <w:start w:val="1"/>
+      <w:numFmt w:val="bullet"/>
+      <w:lvlText w:val=""/>
+      <w:lvlJc w:val="left"/>
+      <w:pPr>
+        <w:tabs>
+          <w:tab w:val="num" w:pos="2160"/>
+        </w:tabs>
+        <w:ind w:left="2160" w:hanging="360"/>
+      </w:pPr>
+      <w:rPr>
+        <w:rFonts w:ascii="Wingdings" w:hAnsi="Wingdings" w:hint="default"/>
+        <w:sz w:val="20"/>
+      </w:rPr>
+    </w:lvl>
+    <w:lvl w:ilvl="3" w:tentative="1">
+      <w:start w:val="1"/>
+      <w:numFmt w:val="bullet"/>
+      <w:lvlText w:val=""/>
+      <w:lvlJc w:val="left"/>
+      <w:pPr>
+        <w:tabs>
+          <w:tab w:val="num" w:pos="2880"/>
+        </w:tabs>
+        <w:ind w:left="2880" w:hanging="360"/>
+      </w:pPr>
+      <w:rPr>
+        <w:rFonts w:ascii="Wingdings" w:hAnsi="Wingdings" w:hint="default"/>
+        <w:sz w:val="20"/>
+      </w:rPr>
+    </w:lvl>
+    <w:lvl w:ilvl="4" w:tentative="1">
+      <w:start w:val="1"/>
+      <w:numFmt w:val="bullet"/>
+      <w:lvlText w:val=""/>
+      <w:lvlJc w:val="left"/>
+      <w:pPr>
+        <w:tabs>
+          <w:tab w:val="num" w:pos="3600"/>
+        </w:tabs>
+        <w:ind w:left="3600" w:hanging="360"/>
+      </w:pPr>
+      <w:rPr>
+        <w:rFonts w:ascii="Wingdings" w:hAnsi="Wingdings" w:hint="default"/>
+        <w:sz w:val="20"/>
+      </w:rPr>
+    </w:lvl>
+    <w:lvl w:ilvl="5" w:tentative="1">
+      <w:start w:val="1"/>
+      <w:numFmt w:val="bullet"/>
+      <w:lvlText w:val=""/>
+      <w:lvlJc w:val="left"/>
+      <w:pPr>
+        <w:tabs>
+          <w:tab w:val="num" w:pos="4320"/>
+        </w:tabs>
+        <w:ind w:left="4320" w:hanging="360"/>
+      </w:pPr>
+      <w:rPr>
+        <w:rFonts w:ascii="Wingdings" w:hAnsi="Wingdings" w:hint="default"/>
+        <w:sz w:val="20"/>
+      </w:rPr>
+    </w:lvl>
+    <w:lvl w:ilvl="6" w:tentative="1">
+      <w:start w:val="1"/>
+      <w:numFmt w:val="bullet"/>
+      <w:lvlText w:val=""/>
+      <w:lvlJc w:val="left"/>
+      <w:pPr>
+        <w:tabs>
+          <w:tab w:val="num" w:pos="5040"/>
+        </w:tabs>
+        <w:ind w:left="5040" w:hanging="360"/>
+      </w:pPr>
+      <w:rPr>
+        <w:rFonts w:ascii="Wingdings" w:hAnsi="Wingdings" w:hint="default"/>
+        <w:sz w:val="20"/>
+      </w:rPr>
+    </w:lvl>
+    <w:lvl w:ilvl="7" w:tentative="1">
+      <w:start w:val="1"/>
+      <w:numFmt w:val="bullet"/>
+      <w:lvlText w:val=""/>
+      <w:lvlJc w:val="left"/>
+      <w:pPr>
+        <w:tabs>
+          <w:tab w:val="num" w:pos="5760"/>
+        </w:tabs>
+        <w:ind w:left="5760" w:hanging="360"/>
+      </w:pPr>
+      <w:rPr>
+        <w:rFonts w:ascii="Wingdings" w:hAnsi="Wingdings" w:hint="default"/>
+        <w:sz w:val="20"/>
+      </w:rPr>
+    </w:lvl>
+    <w:lvl w:ilvl="8" w:tentative="1">
+      <w:start w:val="1"/>
+      <w:numFmt w:val="bullet"/>
+      <w:lvlText w:val=""/>
+      <w:lvlJc w:val="left"/>
+      <w:pPr>
+        <w:tabs>
+          <w:tab w:val="num" w:pos="6480"/>
+        </w:tabs>
+        <w:ind w:left="6480" w:hanging="360"/>
+      </w:pPr>
+      <w:rPr>
+        <w:rFonts w:ascii="Wingdings" w:hAnsi="Wingdings" w:hint="default"/>
+        <w:sz w:val="20"/>
+      </w:rPr>
+    </w:lvl>
+  </w:abstractNum>
+  <w:abstractNum w:abstractNumId="2" w15:restartNumberingAfterBreak="0">
     <w:nsid w:val="11E3640E"/>
     <w:multiLevelType w:val="multilevel"/>
     <w:tmpl w:val="8230FDC8"/>
@@ -33834,7 +36015,7 @@
       </w:rPr>
     </w:lvl>
   </w:abstractNum>
-  <w:abstractNum w:abstractNumId="2" w15:restartNumberingAfterBreak="0">
+  <w:abstractNum w:abstractNumId="3" w15:restartNumberingAfterBreak="0">
     <w:nsid w:val="136C4E80"/>
     <w:multiLevelType w:val="hybridMultilevel"/>
     <w:tmpl w:val="47A84992"/>
@@ -33947,7 +36128,7 @@
       </w:rPr>
     </w:lvl>
   </w:abstractNum>
-  <w:abstractNum w:abstractNumId="3" w15:restartNumberingAfterBreak="0">
+  <w:abstractNum w:abstractNumId="4" w15:restartNumberingAfterBreak="0">
     <w:nsid w:val="193417B5"/>
     <w:multiLevelType w:val="hybridMultilevel"/>
     <w:tmpl w:val="813ECD64"/>
@@ -34060,7 +36241,7 @@
       </w:rPr>
     </w:lvl>
   </w:abstractNum>
-  <w:abstractNum w:abstractNumId="4" w15:restartNumberingAfterBreak="0">
+  <w:abstractNum w:abstractNumId="5" w15:restartNumberingAfterBreak="0">
     <w:nsid w:val="25A307B8"/>
     <w:multiLevelType w:val="multilevel"/>
     <w:tmpl w:val="9B3E375E"/>
@@ -34205,7 +36386,7 @@
       </w:rPr>
     </w:lvl>
   </w:abstractNum>
-  <w:abstractNum w:abstractNumId="5" w15:restartNumberingAfterBreak="0">
+  <w:abstractNum w:abstractNumId="6" w15:restartNumberingAfterBreak="0">
     <w:nsid w:val="2CCF35AC"/>
     <w:multiLevelType w:val="multilevel"/>
     <w:tmpl w:val="C88C3362"/>
@@ -34346,7 +36527,7 @@
       </w:rPr>
     </w:lvl>
   </w:abstractNum>
-  <w:abstractNum w:abstractNumId="6" w15:restartNumberingAfterBreak="0">
+  <w:abstractNum w:abstractNumId="7" w15:restartNumberingAfterBreak="0">
     <w:nsid w:val="2E7328D1"/>
     <w:multiLevelType w:val="multilevel"/>
     <w:tmpl w:val="472CC028"/>
@@ -34459,7 +36640,7 @@
       </w:pPr>
     </w:lvl>
   </w:abstractNum>
-  <w:abstractNum w:abstractNumId="7" w15:restartNumberingAfterBreak="0">
+  <w:abstractNum w:abstractNumId="8" w15:restartNumberingAfterBreak="0">
     <w:nsid w:val="3E2C676B"/>
     <w:multiLevelType w:val="multilevel"/>
     <w:tmpl w:val="2E061FB0"/>
@@ -34608,7 +36789,7 @@
       </w:rPr>
     </w:lvl>
   </w:abstractNum>
-  <w:abstractNum w:abstractNumId="8" w15:restartNumberingAfterBreak="0">
+  <w:abstractNum w:abstractNumId="9" w15:restartNumberingAfterBreak="0">
     <w:nsid w:val="46C11766"/>
     <w:multiLevelType w:val="multilevel"/>
     <w:tmpl w:val="240A0025"/>
@@ -34703,7 +36884,156 @@
       </w:pPr>
     </w:lvl>
   </w:abstractNum>
-  <w:abstractNum w:abstractNumId="9" w15:restartNumberingAfterBreak="0">
+  <w:abstractNum w:abstractNumId="10" w15:restartNumberingAfterBreak="0">
+    <w:nsid w:val="497553CD"/>
+    <w:multiLevelType w:val="multilevel"/>
+    <w:tmpl w:val="BF98BD40"/>
+    <w:lvl w:ilvl="0">
+      <w:start w:val="1"/>
+      <w:numFmt w:val="bullet"/>
+      <w:lvlText w:val=""/>
+      <w:lvlJc w:val="left"/>
+      <w:pPr>
+        <w:tabs>
+          <w:tab w:val="num" w:pos="1429"/>
+        </w:tabs>
+        <w:ind w:left="1429" w:hanging="360"/>
+      </w:pPr>
+      <w:rPr>
+        <w:rFonts w:ascii="Wingdings" w:hAnsi="Wingdings" w:hint="default"/>
+        <w:sz w:val="20"/>
+      </w:rPr>
+    </w:lvl>
+    <w:lvl w:ilvl="1" w:tentative="1">
+      <w:start w:val="1"/>
+      <w:numFmt w:val="bullet"/>
+      <w:lvlText w:val="o"/>
+      <w:lvlJc w:val="left"/>
+      <w:pPr>
+        <w:tabs>
+          <w:tab w:val="num" w:pos="2149"/>
+        </w:tabs>
+        <w:ind w:left="2149" w:hanging="360"/>
+      </w:pPr>
+      <w:rPr>
+        <w:rFonts w:ascii="Courier New" w:hAnsi="Courier New" w:hint="default"/>
+        <w:sz w:val="20"/>
+      </w:rPr>
+    </w:lvl>
+    <w:lvl w:ilvl="2" w:tentative="1">
+      <w:start w:val="1"/>
+      <w:numFmt w:val="bullet"/>
+      <w:lvlText w:val=""/>
+      <w:lvlJc w:val="left"/>
+      <w:pPr>
+        <w:tabs>
+          <w:tab w:val="num" w:pos="2869"/>
+        </w:tabs>
+        <w:ind w:left="2869" w:hanging="360"/>
+      </w:pPr>
+      <w:rPr>
+        <w:rFonts w:ascii="Wingdings" w:hAnsi="Wingdings" w:hint="default"/>
+        <w:sz w:val="20"/>
+      </w:rPr>
+    </w:lvl>
+    <w:lvl w:ilvl="3" w:tentative="1">
+      <w:start w:val="1"/>
+      <w:numFmt w:val="bullet"/>
+      <w:lvlText w:val=""/>
+      <w:lvlJc w:val="left"/>
+      <w:pPr>
+        <w:tabs>
+          <w:tab w:val="num" w:pos="3589"/>
+        </w:tabs>
+        <w:ind w:left="3589" w:hanging="360"/>
+      </w:pPr>
+      <w:rPr>
+        <w:rFonts w:ascii="Wingdings" w:hAnsi="Wingdings" w:hint="default"/>
+        <w:sz w:val="20"/>
+      </w:rPr>
+    </w:lvl>
+    <w:lvl w:ilvl="4" w:tentative="1">
+      <w:start w:val="1"/>
+      <w:numFmt w:val="bullet"/>
+      <w:lvlText w:val=""/>
+      <w:lvlJc w:val="left"/>
+      <w:pPr>
+        <w:tabs>
+          <w:tab w:val="num" w:pos="4309"/>
+        </w:tabs>
+        <w:ind w:left="4309" w:hanging="360"/>
+      </w:pPr>
+      <w:rPr>
+        <w:rFonts w:ascii="Wingdings" w:hAnsi="Wingdings" w:hint="default"/>
+        <w:sz w:val="20"/>
+      </w:rPr>
+    </w:lvl>
+    <w:lvl w:ilvl="5" w:tentative="1">
+      <w:start w:val="1"/>
+      <w:numFmt w:val="bullet"/>
+      <w:lvlText w:val=""/>
+      <w:lvlJc w:val="left"/>
+      <w:pPr>
+        <w:tabs>
+          <w:tab w:val="num" w:pos="5029"/>
+        </w:tabs>
+        <w:ind w:left="5029" w:hanging="360"/>
+      </w:pPr>
+      <w:rPr>
+        <w:rFonts w:ascii="Wingdings" w:hAnsi="Wingdings" w:hint="default"/>
+        <w:sz w:val="20"/>
+      </w:rPr>
+    </w:lvl>
+    <w:lvl w:ilvl="6" w:tentative="1">
+      <w:start w:val="1"/>
+      <w:numFmt w:val="bullet"/>
+      <w:lvlText w:val=""/>
+      <w:lvlJc w:val="left"/>
+      <w:pPr>
+        <w:tabs>
+          <w:tab w:val="num" w:pos="5749"/>
+        </w:tabs>
+        <w:ind w:left="5749" w:hanging="360"/>
+      </w:pPr>
+      <w:rPr>
+        <w:rFonts w:ascii="Wingdings" w:hAnsi="Wingdings" w:hint="default"/>
+        <w:sz w:val="20"/>
+      </w:rPr>
+    </w:lvl>
+    <w:lvl w:ilvl="7" w:tentative="1">
+      <w:start w:val="1"/>
+      <w:numFmt w:val="bullet"/>
+      <w:lvlText w:val=""/>
+      <w:lvlJc w:val="left"/>
+      <w:pPr>
+        <w:tabs>
+          <w:tab w:val="num" w:pos="6469"/>
+        </w:tabs>
+        <w:ind w:left="6469" w:hanging="360"/>
+      </w:pPr>
+      <w:rPr>
+        <w:rFonts w:ascii="Wingdings" w:hAnsi="Wingdings" w:hint="default"/>
+        <w:sz w:val="20"/>
+      </w:rPr>
+    </w:lvl>
+    <w:lvl w:ilvl="8" w:tentative="1">
+      <w:start w:val="1"/>
+      <w:numFmt w:val="bullet"/>
+      <w:lvlText w:val=""/>
+      <w:lvlJc w:val="left"/>
+      <w:pPr>
+        <w:tabs>
+          <w:tab w:val="num" w:pos="7189"/>
+        </w:tabs>
+        <w:ind w:left="7189" w:hanging="360"/>
+      </w:pPr>
+      <w:rPr>
+        <w:rFonts w:ascii="Wingdings" w:hAnsi="Wingdings" w:hint="default"/>
+        <w:sz w:val="20"/>
+      </w:rPr>
+    </w:lvl>
+  </w:abstractNum>
+  <w:abstractNum w:abstractNumId="11" w15:restartNumberingAfterBreak="0">
     <w:nsid w:val="53D55FDE"/>
     <w:multiLevelType w:val="multilevel"/>
     <w:tmpl w:val="240A0025"/>
@@ -34793,7 +37123,156 @@
       </w:pPr>
     </w:lvl>
   </w:abstractNum>
-  <w:abstractNum w:abstractNumId="10" w15:restartNumberingAfterBreak="0">
+  <w:abstractNum w:abstractNumId="12" w15:restartNumberingAfterBreak="0">
+    <w:nsid w:val="6241168C"/>
+    <w:multiLevelType w:val="multilevel"/>
+    <w:tmpl w:val="109C9DD8"/>
+    <w:lvl w:ilvl="0">
+      <w:start w:val="1"/>
+      <w:numFmt w:val="bullet"/>
+      <w:lvlText w:val=""/>
+      <w:lvlJc w:val="left"/>
+      <w:pPr>
+        <w:tabs>
+          <w:tab w:val="num" w:pos="1429"/>
+        </w:tabs>
+        <w:ind w:left="1429" w:hanging="360"/>
+      </w:pPr>
+      <w:rPr>
+        <w:rFonts w:ascii="Wingdings" w:hAnsi="Wingdings" w:hint="default"/>
+        <w:sz w:val="20"/>
+      </w:rPr>
+    </w:lvl>
+    <w:lvl w:ilvl="1" w:tentative="1">
+      <w:start w:val="1"/>
+      <w:numFmt w:val="bullet"/>
+      <w:lvlText w:val="o"/>
+      <w:lvlJc w:val="left"/>
+      <w:pPr>
+        <w:tabs>
+          <w:tab w:val="num" w:pos="2149"/>
+        </w:tabs>
+        <w:ind w:left="2149" w:hanging="360"/>
+      </w:pPr>
+      <w:rPr>
+        <w:rFonts w:ascii="Courier New" w:hAnsi="Courier New" w:hint="default"/>
+        <w:sz w:val="20"/>
+      </w:rPr>
+    </w:lvl>
+    <w:lvl w:ilvl="2" w:tentative="1">
+      <w:start w:val="1"/>
+      <w:numFmt w:val="bullet"/>
+      <w:lvlText w:val=""/>
+      <w:lvlJc w:val="left"/>
+      <w:pPr>
+        <w:tabs>
+          <w:tab w:val="num" w:pos="2869"/>
+        </w:tabs>
+        <w:ind w:left="2869" w:hanging="360"/>
+      </w:pPr>
+      <w:rPr>
+        <w:rFonts w:ascii="Wingdings" w:hAnsi="Wingdings" w:hint="default"/>
+        <w:sz w:val="20"/>
+      </w:rPr>
+    </w:lvl>
+    <w:lvl w:ilvl="3" w:tentative="1">
+      <w:start w:val="1"/>
+      <w:numFmt w:val="bullet"/>
+      <w:lvlText w:val=""/>
+      <w:lvlJc w:val="left"/>
+      <w:pPr>
+        <w:tabs>
+          <w:tab w:val="num" w:pos="3589"/>
+        </w:tabs>
+        <w:ind w:left="3589" w:hanging="360"/>
+      </w:pPr>
+      <w:rPr>
+        <w:rFonts w:ascii="Wingdings" w:hAnsi="Wingdings" w:hint="default"/>
+        <w:sz w:val="20"/>
+      </w:rPr>
+    </w:lvl>
+    <w:lvl w:ilvl="4" w:tentative="1">
+      <w:start w:val="1"/>
+      <w:numFmt w:val="bullet"/>
+      <w:lvlText w:val=""/>
+      <w:lvlJc w:val="left"/>
+      <w:pPr>
+        <w:tabs>
+          <w:tab w:val="num" w:pos="4309"/>
+        </w:tabs>
+        <w:ind w:left="4309" w:hanging="360"/>
+      </w:pPr>
+      <w:rPr>
+        <w:rFonts w:ascii="Wingdings" w:hAnsi="Wingdings" w:hint="default"/>
+        <w:sz w:val="20"/>
+      </w:rPr>
+    </w:lvl>
+    <w:lvl w:ilvl="5" w:tentative="1">
+      <w:start w:val="1"/>
+      <w:numFmt w:val="bullet"/>
+      <w:lvlText w:val=""/>
+      <w:lvlJc w:val="left"/>
+      <w:pPr>
+        <w:tabs>
+          <w:tab w:val="num" w:pos="5029"/>
+        </w:tabs>
+        <w:ind w:left="5029" w:hanging="360"/>
+      </w:pPr>
+      <w:rPr>
+        <w:rFonts w:ascii="Wingdings" w:hAnsi="Wingdings" w:hint="default"/>
+        <w:sz w:val="20"/>
+      </w:rPr>
+    </w:lvl>
+    <w:lvl w:ilvl="6" w:tentative="1">
+      <w:start w:val="1"/>
+      <w:numFmt w:val="bullet"/>
+      <w:lvlText w:val=""/>
+      <w:lvlJc w:val="left"/>
+      <w:pPr>
+        <w:tabs>
+          <w:tab w:val="num" w:pos="5749"/>
+        </w:tabs>
+        <w:ind w:left="5749" w:hanging="360"/>
+      </w:pPr>
+      <w:rPr>
+        <w:rFonts w:ascii="Wingdings" w:hAnsi="Wingdings" w:hint="default"/>
+        <w:sz w:val="20"/>
+      </w:rPr>
+    </w:lvl>
+    <w:lvl w:ilvl="7" w:tentative="1">
+      <w:start w:val="1"/>
+      <w:numFmt w:val="bullet"/>
+      <w:lvlText w:val=""/>
+      <w:lvlJc w:val="left"/>
+      <w:pPr>
+        <w:tabs>
+          <w:tab w:val="num" w:pos="6469"/>
+        </w:tabs>
+        <w:ind w:left="6469" w:hanging="360"/>
+      </w:pPr>
+      <w:rPr>
+        <w:rFonts w:ascii="Wingdings" w:hAnsi="Wingdings" w:hint="default"/>
+        <w:sz w:val="20"/>
+      </w:rPr>
+    </w:lvl>
+    <w:lvl w:ilvl="8" w:tentative="1">
+      <w:start w:val="1"/>
+      <w:numFmt w:val="bullet"/>
+      <w:lvlText w:val=""/>
+      <w:lvlJc w:val="left"/>
+      <w:pPr>
+        <w:tabs>
+          <w:tab w:val="num" w:pos="7189"/>
+        </w:tabs>
+        <w:ind w:left="7189" w:hanging="360"/>
+      </w:pPr>
+      <w:rPr>
+        <w:rFonts w:ascii="Wingdings" w:hAnsi="Wingdings" w:hint="default"/>
+        <w:sz w:val="20"/>
+      </w:rPr>
+    </w:lvl>
+  </w:abstractNum>
+  <w:abstractNum w:abstractNumId="13" w15:restartNumberingAfterBreak="0">
     <w:nsid w:val="76F15302"/>
     <w:multiLevelType w:val="hybridMultilevel"/>
     <w:tmpl w:val="55668B86"/>
@@ -34906,38 +37385,199 @@
       </w:rPr>
     </w:lvl>
   </w:abstractNum>
+  <w:abstractNum w:abstractNumId="14" w15:restartNumberingAfterBreak="0">
+    <w:nsid w:val="794C3D7E"/>
+    <w:multiLevelType w:val="multilevel"/>
+    <w:tmpl w:val="92EE3EC0"/>
+    <w:lvl w:ilvl="0">
+      <w:start w:val="1"/>
+      <w:numFmt w:val="bullet"/>
+      <w:lvlText w:val=""/>
+      <w:lvlJc w:val="left"/>
+      <w:pPr>
+        <w:tabs>
+          <w:tab w:val="num" w:pos="1068"/>
+        </w:tabs>
+        <w:ind w:left="1068" w:hanging="360"/>
+      </w:pPr>
+      <w:rPr>
+        <w:rFonts w:ascii="Symbol" w:hAnsi="Symbol" w:hint="default"/>
+        <w:sz w:val="20"/>
+      </w:rPr>
+    </w:lvl>
+    <w:lvl w:ilvl="1" w:tentative="1">
+      <w:start w:val="1"/>
+      <w:numFmt w:val="bullet"/>
+      <w:lvlText w:val="o"/>
+      <w:lvlJc w:val="left"/>
+      <w:pPr>
+        <w:tabs>
+          <w:tab w:val="num" w:pos="1788"/>
+        </w:tabs>
+        <w:ind w:left="1788" w:hanging="360"/>
+      </w:pPr>
+      <w:rPr>
+        <w:rFonts w:ascii="Courier New" w:hAnsi="Courier New" w:hint="default"/>
+        <w:sz w:val="20"/>
+      </w:rPr>
+    </w:lvl>
+    <w:lvl w:ilvl="2" w:tentative="1">
+      <w:start w:val="1"/>
+      <w:numFmt w:val="bullet"/>
+      <w:lvlText w:val=""/>
+      <w:lvlJc w:val="left"/>
+      <w:pPr>
+        <w:tabs>
+          <w:tab w:val="num" w:pos="2508"/>
+        </w:tabs>
+        <w:ind w:left="2508" w:hanging="360"/>
+      </w:pPr>
+      <w:rPr>
+        <w:rFonts w:ascii="Wingdings" w:hAnsi="Wingdings" w:hint="default"/>
+        <w:sz w:val="20"/>
+      </w:rPr>
+    </w:lvl>
+    <w:lvl w:ilvl="3" w:tentative="1">
+      <w:start w:val="1"/>
+      <w:numFmt w:val="bullet"/>
+      <w:lvlText w:val=""/>
+      <w:lvlJc w:val="left"/>
+      <w:pPr>
+        <w:tabs>
+          <w:tab w:val="num" w:pos="3228"/>
+        </w:tabs>
+        <w:ind w:left="3228" w:hanging="360"/>
+      </w:pPr>
+      <w:rPr>
+        <w:rFonts w:ascii="Wingdings" w:hAnsi="Wingdings" w:hint="default"/>
+        <w:sz w:val="20"/>
+      </w:rPr>
+    </w:lvl>
+    <w:lvl w:ilvl="4" w:tentative="1">
+      <w:start w:val="1"/>
+      <w:numFmt w:val="bullet"/>
+      <w:lvlText w:val=""/>
+      <w:lvlJc w:val="left"/>
+      <w:pPr>
+        <w:tabs>
+          <w:tab w:val="num" w:pos="3948"/>
+        </w:tabs>
+        <w:ind w:left="3948" w:hanging="360"/>
+      </w:pPr>
+      <w:rPr>
+        <w:rFonts w:ascii="Wingdings" w:hAnsi="Wingdings" w:hint="default"/>
+        <w:sz w:val="20"/>
+      </w:rPr>
+    </w:lvl>
+    <w:lvl w:ilvl="5" w:tentative="1">
+      <w:start w:val="1"/>
+      <w:numFmt w:val="bullet"/>
+      <w:lvlText w:val=""/>
+      <w:lvlJc w:val="left"/>
+      <w:pPr>
+        <w:tabs>
+          <w:tab w:val="num" w:pos="4668"/>
+        </w:tabs>
+        <w:ind w:left="4668" w:hanging="360"/>
+      </w:pPr>
+      <w:rPr>
+        <w:rFonts w:ascii="Wingdings" w:hAnsi="Wingdings" w:hint="default"/>
+        <w:sz w:val="20"/>
+      </w:rPr>
+    </w:lvl>
+    <w:lvl w:ilvl="6" w:tentative="1">
+      <w:start w:val="1"/>
+      <w:numFmt w:val="bullet"/>
+      <w:lvlText w:val=""/>
+      <w:lvlJc w:val="left"/>
+      <w:pPr>
+        <w:tabs>
+          <w:tab w:val="num" w:pos="5388"/>
+        </w:tabs>
+        <w:ind w:left="5388" w:hanging="360"/>
+      </w:pPr>
+      <w:rPr>
+        <w:rFonts w:ascii="Wingdings" w:hAnsi="Wingdings" w:hint="default"/>
+        <w:sz w:val="20"/>
+      </w:rPr>
+    </w:lvl>
+    <w:lvl w:ilvl="7" w:tentative="1">
+      <w:start w:val="1"/>
+      <w:numFmt w:val="bullet"/>
+      <w:lvlText w:val=""/>
+      <w:lvlJc w:val="left"/>
+      <w:pPr>
+        <w:tabs>
+          <w:tab w:val="num" w:pos="6108"/>
+        </w:tabs>
+        <w:ind w:left="6108" w:hanging="360"/>
+      </w:pPr>
+      <w:rPr>
+        <w:rFonts w:ascii="Wingdings" w:hAnsi="Wingdings" w:hint="default"/>
+        <w:sz w:val="20"/>
+      </w:rPr>
+    </w:lvl>
+    <w:lvl w:ilvl="8" w:tentative="1">
+      <w:start w:val="1"/>
+      <w:numFmt w:val="bullet"/>
+      <w:lvlText w:val=""/>
+      <w:lvlJc w:val="left"/>
+      <w:pPr>
+        <w:tabs>
+          <w:tab w:val="num" w:pos="6828"/>
+        </w:tabs>
+        <w:ind w:left="6828" w:hanging="360"/>
+      </w:pPr>
+      <w:rPr>
+        <w:rFonts w:ascii="Wingdings" w:hAnsi="Wingdings" w:hint="default"/>
+        <w:sz w:val="20"/>
+      </w:rPr>
+    </w:lvl>
+  </w:abstractNum>
   <w:num w:numId="1" w16cid:durableId="860045234">
-    <w:abstractNumId w:val="4"/>
+    <w:abstractNumId w:val="5"/>
   </w:num>
   <w:num w:numId="2" w16cid:durableId="831064010">
     <w:abstractNumId w:val="0"/>
   </w:num>
   <w:num w:numId="3" w16cid:durableId="450322985">
+    <w:abstractNumId w:val="3"/>
+  </w:num>
+  <w:num w:numId="4" w16cid:durableId="184177234">
+    <w:abstractNumId w:val="11"/>
+  </w:num>
+  <w:num w:numId="5" w16cid:durableId="293877059">
+    <w:abstractNumId w:val="13"/>
+  </w:num>
+  <w:num w:numId="6" w16cid:durableId="363017381">
+    <w:abstractNumId w:val="8"/>
+  </w:num>
+  <w:num w:numId="7" w16cid:durableId="629361301">
+    <w:abstractNumId w:val="7"/>
+  </w:num>
+  <w:num w:numId="8" w16cid:durableId="1776510257">
+    <w:abstractNumId w:val="6"/>
+  </w:num>
+  <w:num w:numId="9" w16cid:durableId="1407921062">
+    <w:abstractNumId w:val="9"/>
+  </w:num>
+  <w:num w:numId="10" w16cid:durableId="1116367997">
     <w:abstractNumId w:val="2"/>
   </w:num>
-  <w:num w:numId="4" w16cid:durableId="184177234">
-    <w:abstractNumId w:val="9"/>
+  <w:num w:numId="11" w16cid:durableId="421872758">
+    <w:abstractNumId w:val="4"/>
   </w:num>
-  <w:num w:numId="5" w16cid:durableId="293877059">
-    <w:abstractNumId w:val="10"/>
-  </w:num>
-  <w:num w:numId="6" w16cid:durableId="363017381">
-    <w:abstractNumId w:val="7"/>
-  </w:num>
-  <w:num w:numId="7" w16cid:durableId="629361301">
-    <w:abstractNumId w:val="6"/>
-  </w:num>
-  <w:num w:numId="8" w16cid:durableId="1776510257">
-    <w:abstractNumId w:val="5"/>
-  </w:num>
-  <w:num w:numId="9" w16cid:durableId="1407921062">
-    <w:abstractNumId w:val="8"/>
-  </w:num>
-  <w:num w:numId="10" w16cid:durableId="1116367997">
+  <w:num w:numId="12" w16cid:durableId="2116247500">
     <w:abstractNumId w:val="1"/>
   </w:num>
-  <w:num w:numId="11" w16cid:durableId="421872758">
-    <w:abstractNumId w:val="3"/>
+  <w:num w:numId="13" w16cid:durableId="499197270">
+    <w:abstractNumId w:val="12"/>
+  </w:num>
+  <w:num w:numId="14" w16cid:durableId="276302548">
+    <w:abstractNumId w:val="14"/>
+  </w:num>
+  <w:num w:numId="15" w16cid:durableId="425809230">
+    <w:abstractNumId w:val="10"/>
   </w:num>
   <w:numIdMacAtCleanup w:val="11"/>
 </w:numbering>
@@ -36038,6 +38678,18 @@
       <w14:ligatures w14:val="none"/>
     </w:rPr>
   </w:style>
+  <w:style w:type="character" w:styleId="Mencinsinresolver">
+    <w:name w:val="Unresolved Mention"/>
+    <w:basedOn w:val="Fuentedeprrafopredeter"/>
+    <w:uiPriority w:val="99"/>
+    <w:semiHidden/>
+    <w:unhideWhenUsed/>
+    <w:rsid w:val="00A71B56"/>
+    <w:rPr>
+      <w:color w:val="605E5C"/>
+      <w:shd w:val="clear" w:color="auto" w:fill="E1DFDD"/>
+    </w:rPr>
+  </w:style>
 </w:styles>
 </file>
 
@@ -36338,7 +38990,7 @@
 
 <file path=customXml/item1.xml><?xml version="1.0" encoding="utf-8"?>
 <CoverPageProperties xmlns="http://schemas.microsoft.com/office/2006/coverPageProps">
-  <PublishDate>06 de abril de 2026</PublishDate>
+  <PublishDate>13 de abril de 2026</PublishDate>
   <Abstract/>
   <CompanyAddress/>
   <CompanyPhone/>

</xml_diff>